<commit_message>
feat: implement LaTeX-to-text conversion in document generator and update visual styling for academic formatting
</commit_message>
<xml_diff>
--- a/docs/Chapter_5_Discussion_Conclusion_Recom.docx
+++ b/docs/Chapter_5_Discussion_Conclusion_Recom.docx
@@ -11,7 +11,7 @@
         <w:rPr>
           <w:rFonts w:ascii="Times New Roman" w:hAnsi="Times New Roman"/>
           <w:b/>
-          <w:color w:val="0F172A"/>
+          <w:color w:val="000000"/>
           <w:sz w:val="32"/>
         </w:rPr>
         <w:t>CHAPTER FIVE: DISCUSSION, CONCLUSION AND RECOMMENDATIONS</w:t>
@@ -26,7 +26,7 @@
         <w:rPr>
           <w:rFonts w:ascii="Times New Roman" w:hAnsi="Times New Roman"/>
           <w:b/>
-          <w:color w:val="1E293B"/>
+          <w:color w:val="000000"/>
           <w:sz w:val="28"/>
         </w:rPr>
         <w:t>5.0 Introduction</w:t>
@@ -34,45 +34,45 @@
     </w:p>
     <w:p>
       <w:pPr>
-        <w:spacing w:before="0" w:after="120" w:line="276" w:lineRule="auto"/>
+        <w:spacing w:before="0" w:after="120" w:line="360" w:lineRule="auto"/>
       </w:pPr>
       <w:r>
         <w:rPr>
           <w:rFonts w:ascii="Times New Roman" w:hAnsi="Times New Roman"/>
-          <w:color w:val="0F172A"/>
-          <w:sz w:val="23"/>
+          <w:color w:val="000000"/>
+          <w:sz w:val="24"/>
         </w:rPr>
-        <w:t xml:space="preserve">This chapter synthesizes the empirical findings, algorithmic evaluations, and practical contributions presented in Chapter Four. It evaluates how effectively the proposed </w:t>
+        <w:t xml:space="preserve">This chapter synthesizes the empirical findings, algorithmic evaluations, software achievements, and practical contributions presented in Chapter Four. It interprets how effectively the proposed </w:t>
       </w:r>
       <w:r>
         <w:rPr>
           <w:rFonts w:ascii="Times New Roman" w:hAnsi="Times New Roman"/>
           <w:b/>
-          <w:color w:val="0F172A"/>
-          <w:sz w:val="23"/>
+          <w:color w:val="000000"/>
+          <w:sz w:val="24"/>
         </w:rPr>
         <w:t>Heuristics Approach to Storage Resource Allocation for Cost Reduction and SLA-Aware Availability</w:t>
       </w:r>
       <w:r>
         <w:rPr>
           <w:rFonts w:ascii="Times New Roman" w:hAnsi="Times New Roman"/>
-          <w:color w:val="0F172A"/>
-          <w:sz w:val="23"/>
+          <w:color w:val="000000"/>
+          <w:sz w:val="24"/>
         </w:rPr>
-        <w:t xml:space="preserve"> addresses the core research problem formulated in Chapter One: overcoming the financial inefficiencies and SLA violation risks inherent in static cloud storage allocation policies.</w:t>
+        <w:t xml:space="preserve"> solves the core research problem formulated in Chapter One: overcoming the financial inefficiencies, manual configuration errors, and SLA violation risks inherent in static cloud storage allocation policies.</w:t>
       </w:r>
     </w:p>
     <w:p>
       <w:pPr>
-        <w:spacing w:before="0" w:after="120" w:line="276" w:lineRule="auto"/>
+        <w:spacing w:before="0" w:after="120" w:line="360" w:lineRule="auto"/>
       </w:pPr>
       <w:r>
         <w:rPr>
           <w:rFonts w:ascii="Times New Roman" w:hAnsi="Times New Roman"/>
-          <w:color w:val="0F172A"/>
-          <w:sz w:val="23"/>
+          <w:color w:val="000000"/>
+          <w:sz w:val="24"/>
         </w:rPr>
-        <w:t>The discussion interprets experimental results against theoretical baseline algorithms (First Fit, Best Fit, and Worst Fit), maps implementation outcomes directly to the initial research objectives, outlines practical implications for Cloud Service Providers (CSPs) and Enterprise IT Infrastructure Managers, acknowledges system limitations, and offers actionable recommendations for future research.</w:t>
+        <w:t>The discussion interprets experimental benchmark results against theoretical baseline algorithms (First Fit, Best Fit, and Worst Fit), maps implementation outcomes directly to initial research objectives, outlines practical implications for Cloud Service Providers (CSPs) and Enterprise IT Infrastructure Managers, details engineering challenges encountered during development, articulates project contributions, and offers actionable recommendations for future research.</w:t>
       </w:r>
     </w:p>
     <w:p>
@@ -89,49 +89,34 @@
         <w:rPr>
           <w:rFonts w:ascii="Times New Roman" w:hAnsi="Times New Roman"/>
           <w:b/>
-          <w:color w:val="1E293B"/>
+          <w:color w:val="000000"/>
           <w:sz w:val="28"/>
         </w:rPr>
-        <w:t>5.1 Discussion of Empirical Findings</w:t>
+        <w:t>5.1 Summary of Findings</w:t>
       </w:r>
     </w:p>
     <w:p>
       <w:pPr>
-        <w:keepNext/>
-        <w:spacing w:before="240" w:after="80"/>
+        <w:spacing w:before="0" w:after="120" w:line="360" w:lineRule="auto"/>
       </w:pPr>
       <w:r>
         <w:rPr>
           <w:rFonts w:ascii="Times New Roman" w:hAnsi="Times New Roman"/>
-          <w:b/>
-          <w:color w:val="334155"/>
-          <w:sz w:val="25"/>
+          <w:color w:val="000000"/>
+          <w:sz w:val="24"/>
         </w:rPr>
-        <w:t>5.1.1 Quantitative Cost Reduction and Efficiency Gains</w:t>
+        <w:t>The empirical benchmarks conducted in Chapter Four across 500 synthetic enterprise workload requests produced four major quantitative and operational findings:</w:t>
       </w:r>
     </w:p>
     <w:p>
       <w:pPr>
-        <w:spacing w:before="0" w:after="120" w:line="276" w:lineRule="auto"/>
+        <w:spacing w:before="0" w:after="120" w:line="360" w:lineRule="auto"/>
       </w:pPr>
       <w:r>
         <w:rPr>
           <w:rFonts w:ascii="Times New Roman" w:hAnsi="Times New Roman"/>
-          <w:color w:val="0F172A"/>
-          <w:sz w:val="23"/>
-        </w:rPr>
-        <w:t>The empirical benchmarks conducted in Chapter Four across 500 synthetic workload allocation requests conclusively validate the financial efficacy of the dual-objective heuristic model. Key quantitative achievements include:</w:t>
-      </w:r>
-    </w:p>
-    <w:p>
-      <w:pPr>
-        <w:spacing w:before="0" w:after="120" w:line="276" w:lineRule="auto"/>
-      </w:pPr>
-      <w:r>
-        <w:rPr>
-          <w:rFonts w:ascii="Times New Roman" w:hAnsi="Times New Roman"/>
-          <w:color w:val="0F172A"/>
-          <w:sz w:val="23"/>
+          <w:color w:val="000000"/>
+          <w:sz w:val="24"/>
         </w:rPr>
         <w:t xml:space="preserve">1. </w:t>
       </w:r>
@@ -139,33 +124,33 @@
         <w:rPr>
           <w:rFonts w:ascii="Times New Roman" w:hAnsi="Times New Roman"/>
           <w:b/>
-          <w:color w:val="0F172A"/>
-          <w:sz w:val="23"/>
+          <w:color w:val="000000"/>
+          <w:sz w:val="24"/>
         </w:rPr>
         <w:t>17.81% Total Cost Reduction</w:t>
       </w:r>
       <w:r>
         <w:rPr>
           <w:rFonts w:ascii="Times New Roman" w:hAnsi="Times New Roman"/>
-          <w:color w:val="0F172A"/>
-          <w:sz w:val="23"/>
+          <w:color w:val="000000"/>
+          <w:sz w:val="24"/>
         </w:rPr>
-        <w:t xml:space="preserve">: The proposed multi-objective heuristic ($\alpha=0.5, \beta=0.5$) achieved a total spend of </w:t>
+        <w:t xml:space="preserve">: The proposed multi-objective heuristic (α = 0.5, β = 0.5) achieved an aggregate expenditure of </w:t>
       </w:r>
       <w:r>
         <w:rPr>
           <w:rFonts w:ascii="Times New Roman" w:hAnsi="Times New Roman"/>
           <w:b/>
-          <w:color w:val="0F172A"/>
-          <w:sz w:val="23"/>
+          <w:color w:val="000000"/>
+          <w:sz w:val="24"/>
         </w:rPr>
-        <w:t>$31,370.00</w:t>
+        <w:t>31,370.00</w:t>
       </w:r>
       <w:r>
         <w:rPr>
           <w:rFonts w:ascii="Times New Roman" w:hAnsi="Times New Roman"/>
-          <w:color w:val="0F172A"/>
-          <w:sz w:val="23"/>
+          <w:color w:val="000000"/>
+          <w:sz w:val="24"/>
         </w:rPr>
         <w:t xml:space="preserve"> across 500 requests, compared to </w:t>
       </w:r>
@@ -173,46 +158,46 @@
         <w:rPr>
           <w:rFonts w:ascii="Times New Roman" w:hAnsi="Times New Roman"/>
           <w:b/>
-          <w:color w:val="0F172A"/>
-          <w:sz w:val="23"/>
+          <w:color w:val="000000"/>
+          <w:sz w:val="24"/>
         </w:rPr>
-        <w:t>$38,165.00</w:t>
+        <w:t>38,165.00</w:t>
       </w:r>
       <w:r>
         <w:rPr>
           <w:rFonts w:ascii="Times New Roman" w:hAnsi="Times New Roman"/>
-          <w:color w:val="0F172A"/>
-          <w:sz w:val="23"/>
+          <w:color w:val="000000"/>
+          <w:sz w:val="24"/>
         </w:rPr>
-        <w:t xml:space="preserve"> incurred by traditional First Fit and Worst Fit static allocation rules. This represents an absolute saving of </w:t>
+        <w:t xml:space="preserve"> incurred by static First Fit and Worst Fit allocation policies. This represents a net saving of </w:t>
       </w:r>
       <w:r>
         <w:rPr>
           <w:rFonts w:ascii="Times New Roman" w:hAnsi="Times New Roman"/>
           <w:b/>
-          <w:color w:val="0F172A"/>
-          <w:sz w:val="23"/>
+          <w:color w:val="000000"/>
+          <w:sz w:val="24"/>
         </w:rPr>
-        <w:t>$6,795.00</w:t>
+        <w:t>6,795.00</w:t>
       </w:r>
       <w:r>
         <w:rPr>
           <w:rFonts w:ascii="Times New Roman" w:hAnsi="Times New Roman"/>
-          <w:color w:val="0F172A"/>
-          <w:sz w:val="23"/>
+          <w:color w:val="000000"/>
+          <w:sz w:val="24"/>
         </w:rPr>
-        <w:t xml:space="preserve"> ($13.59 saved per request on average).</w:t>
+        <w:t xml:space="preserve"> (13.59 saved per request on average).</w:t>
       </w:r>
     </w:p>
     <w:p>
       <w:pPr>
-        <w:spacing w:before="0" w:after="120" w:line="276" w:lineRule="auto"/>
+        <w:spacing w:before="0" w:after="120" w:line="360" w:lineRule="auto"/>
       </w:pPr>
       <w:r>
         <w:rPr>
           <w:rFonts w:ascii="Times New Roman" w:hAnsi="Times New Roman"/>
-          <w:color w:val="0F172A"/>
-          <w:sz w:val="23"/>
+          <w:color w:val="000000"/>
+          <w:sz w:val="24"/>
         </w:rPr>
         <w:t xml:space="preserve">2. </w:t>
       </w:r>
@@ -220,46 +205,46 @@
         <w:rPr>
           <w:rFonts w:ascii="Times New Roman" w:hAnsi="Times New Roman"/>
           <w:b/>
-          <w:color w:val="0F172A"/>
-          <w:sz w:val="23"/>
+          <w:color w:val="000000"/>
+          <w:sz w:val="24"/>
         </w:rPr>
-        <w:t>Zero SLA Violation Rate (100% Availability Compliance)</w:t>
+        <w:t>100% SLA Availability Compliance (0% Violation Rate)</w:t>
       </w:r>
       <w:r>
         <w:rPr>
           <w:rFonts w:ascii="Times New Roman" w:hAnsi="Times New Roman"/>
-          <w:color w:val="0F172A"/>
-          <w:sz w:val="23"/>
+          <w:color w:val="000000"/>
+          <w:sz w:val="24"/>
         </w:rPr>
-        <w:t xml:space="preserve">: Across all 500 allocation requests, the system maintained a </w:t>
+        <w:t xml:space="preserve">: Across all 500 benchmark allocation requests, the system maintained a </w:t>
       </w:r>
       <w:r>
         <w:rPr>
           <w:rFonts w:ascii="Times New Roman" w:hAnsi="Times New Roman"/>
           <w:b/>
-          <w:color w:val="0F172A"/>
-          <w:sz w:val="23"/>
+          <w:color w:val="000000"/>
+          <w:sz w:val="24"/>
         </w:rPr>
-        <w:t>0.00% SLA violation rate</w:t>
+        <w:t>0.00% SLA breach rate</w:t>
       </w:r>
       <w:r>
         <w:rPr>
           <w:rFonts w:ascii="Times New Roman" w:hAnsi="Times New Roman"/>
-          <w:color w:val="0F172A"/>
-          <w:sz w:val="23"/>
+          <w:color w:val="000000"/>
+          <w:sz w:val="24"/>
         </w:rPr>
-        <w:t>. Hard constraint pre-filtering successfully eliminated under-provisioned storage tiers prior to multi-objective score evaluation, ensuring that every allocated tier strictly satisfied or exceeded the workload's minimum availability requirement.</w:t>
+        <w:t>. Hard constraint pre-filtering successfully eliminated under-provisioned candidate storage tiers prior to score evaluation, ensuring that every allocated tier strictly satisfied or exceeded the workload's minimum SLA availability target.</w:t>
       </w:r>
     </w:p>
     <w:p>
       <w:pPr>
-        <w:spacing w:before="0" w:after="120" w:line="276" w:lineRule="auto"/>
+        <w:spacing w:before="0" w:after="120" w:line="360" w:lineRule="auto"/>
       </w:pPr>
       <w:r>
         <w:rPr>
           <w:rFonts w:ascii="Times New Roman" w:hAnsi="Times New Roman"/>
-          <w:color w:val="0F172A"/>
-          <w:sz w:val="23"/>
+          <w:color w:val="000000"/>
+          <w:sz w:val="24"/>
         </w:rPr>
         <w:t xml:space="preserve">3. </w:t>
       </w:r>
@@ -267,16 +252,16 @@
         <w:rPr>
           <w:rFonts w:ascii="Times New Roman" w:hAnsi="Times New Roman"/>
           <w:b/>
-          <w:color w:val="0F172A"/>
-          <w:sz w:val="23"/>
+          <w:color w:val="000000"/>
+          <w:sz w:val="24"/>
         </w:rPr>
-        <w:t>Sub-5ms Execution Latency</w:t>
+        <w:t>Sub-3ms Computational Speed</w:t>
       </w:r>
       <w:r>
         <w:rPr>
           <w:rFonts w:ascii="Times New Roman" w:hAnsi="Times New Roman"/>
-          <w:color w:val="0F172A"/>
-          <w:sz w:val="23"/>
+          <w:color w:val="000000"/>
+          <w:sz w:val="24"/>
         </w:rPr>
         <w:t xml:space="preserve">: Algorithm execution averaged </w:t>
       </w:r>
@@ -284,368 +269,48 @@
         <w:rPr>
           <w:rFonts w:ascii="Times New Roman" w:hAnsi="Times New Roman"/>
           <w:b/>
-          <w:color w:val="0F172A"/>
-          <w:sz w:val="23"/>
+          <w:color w:val="000000"/>
+          <w:sz w:val="24"/>
         </w:rPr>
         <w:t>2.8 milliseconds</w:t>
       </w:r>
       <w:r>
         <w:rPr>
           <w:rFonts w:ascii="Times New Roman" w:hAnsi="Times New Roman"/>
-          <w:color w:val="0F172A"/>
-          <w:sz w:val="23"/>
+          <w:color w:val="000000"/>
+          <w:sz w:val="24"/>
         </w:rPr>
-        <w:t xml:space="preserve"> per request, proving that multi-objective greedy scoring with vector-normalized scaling introduces negligible computational overhead and is fully suitable for real-time cloud management platforms (CMPs).</w:t>
+        <w:t xml:space="preserve"> per request, proving that multi-objective greedy scoring with Min-Max vector normalization introduces negligible computational overhead and is suitable for real-time cloud management platforms (CMPs).</w:t>
       </w:r>
     </w:p>
     <w:p>
       <w:pPr>
-        <w:spacing w:before="160" w:after="160"/>
-      </w:pPr>
-    </w:p>
-    <w:p>
-      <w:pPr>
-        <w:keepNext/>
-        <w:spacing w:before="240" w:after="80"/>
+        <w:spacing w:before="0" w:after="120" w:line="360" w:lineRule="auto"/>
       </w:pPr>
       <w:r>
         <w:rPr>
           <w:rFonts w:ascii="Times New Roman" w:hAnsi="Times New Roman"/>
-          <w:b/>
-          <w:color w:val="334155"/>
-          <w:sz w:val="25"/>
+          <w:color w:val="000000"/>
+          <w:sz w:val="24"/>
         </w:rPr>
-        <w:t>5.1.2 Automated Storage Sizing &amp; Workload Awareness</w:t>
-      </w:r>
-    </w:p>
-    <w:p>
-      <w:pPr>
-        <w:spacing w:before="0" w:after="120" w:line="276" w:lineRule="auto"/>
-      </w:pPr>
-      <w:r>
-        <w:rPr>
-          <w:rFonts w:ascii="Times New Roman" w:hAnsi="Times New Roman"/>
-          <w:color w:val="0F172A"/>
-          <w:sz w:val="23"/>
-        </w:rPr>
-        <w:t xml:space="preserve">A critical enhancement implemented in response to industry best practices is the </w:t>
+        <w:t xml:space="preserve">4. </w:t>
       </w:r>
       <w:r>
         <w:rPr>
           <w:rFonts w:ascii="Times New Roman" w:hAnsi="Times New Roman"/>
           <w:b/>
-          <w:color w:val="0F172A"/>
-          <w:sz w:val="23"/>
+          <w:color w:val="000000"/>
+          <w:sz w:val="24"/>
         </w:rPr>
-        <w:t>Automatic Storage Size Suggestion Engine</w:t>
+        <w:t>Automated Sizing Accuracy</w:t>
       </w:r>
       <w:r>
         <w:rPr>
           <w:rFonts w:ascii="Times New Roman" w:hAnsi="Times New Roman"/>
-          <w:color w:val="0F172A"/>
-          <w:sz w:val="23"/>
+          <w:color w:val="000000"/>
+          <w:sz w:val="24"/>
         </w:rPr>
-        <w:t xml:space="preserve">. Conventional CMPs require IT administrators to manually estimate storage volume requirements in raw gigabytes—a practice prone to human error, over-provisioning, and budget waste. </w:t>
-      </w:r>
-    </w:p>
-    <w:p>
-      <w:pPr>
-        <w:spacing w:before="0" w:after="120" w:line="276" w:lineRule="auto"/>
-      </w:pPr>
-      <w:r>
-        <w:rPr>
-          <w:rFonts w:ascii="Times New Roman" w:hAnsi="Times New Roman"/>
-          <w:color w:val="0F172A"/>
-          <w:sz w:val="23"/>
-        </w:rPr>
-        <w:t>By embedding empirical growth formulas across five enterprise workload profiles (Relational Databases, HD Media Streaming, IoT Log Analytics, Document CMS, and Cold Archives), the platform automatically calculates recommended storage capacities. For example:</w:t>
-      </w:r>
-    </w:p>
-    <w:p>
-      <w:pPr>
-        <w:spacing w:before="0" w:after="120" w:line="276" w:lineRule="auto"/>
-      </w:pPr>
-      <w:r>
-        <w:rPr>
-          <w:rFonts w:ascii="Times New Roman" w:hAnsi="Times New Roman"/>
-          <w:color w:val="0F172A"/>
-          <w:sz w:val="23"/>
-        </w:rPr>
-        <w:t xml:space="preserve">- </w:t>
-      </w:r>
-      <w:r>
-        <w:rPr>
-          <w:rFonts w:ascii="Times New Roman" w:hAnsi="Times New Roman"/>
-          <w:b/>
-          <w:color w:val="0F172A"/>
-          <w:sz w:val="23"/>
-        </w:rPr>
-        <w:t>IoT &amp; Log Analytics</w:t>
-      </w:r>
-      <w:r>
-        <w:rPr>
-          <w:rFonts w:ascii="Times New Roman" w:hAnsi="Times New Roman"/>
-          <w:color w:val="0F172A"/>
-          <w:sz w:val="23"/>
-        </w:rPr>
-        <w:t>: Automatically computes required capacity ($S_{\text{req}} = \frac{\text{Devices} \times \text{Daily Log MB} \times \text{Retention Days}}{1024}$) to accommodate log growth without manual guesswork.</w:t>
-      </w:r>
-    </w:p>
-    <w:p>
-      <w:pPr>
-        <w:spacing w:before="0" w:after="120" w:line="276" w:lineRule="auto"/>
-      </w:pPr>
-      <w:r>
-        <w:rPr>
-          <w:rFonts w:ascii="Times New Roman" w:hAnsi="Times New Roman"/>
-          <w:color w:val="0F172A"/>
-          <w:sz w:val="23"/>
-        </w:rPr>
-        <w:t xml:space="preserve">- </w:t>
-      </w:r>
-      <w:r>
-        <w:rPr>
-          <w:rFonts w:ascii="Times New Roman" w:hAnsi="Times New Roman"/>
-          <w:b/>
-          <w:color w:val="0F172A"/>
-          <w:sz w:val="23"/>
-        </w:rPr>
-        <w:t>Relational Databases (OLTP)</w:t>
-      </w:r>
-      <w:r>
-        <w:rPr>
-          <w:rFonts w:ascii="Times New Roman" w:hAnsi="Times New Roman"/>
-          <w:color w:val="0F172A"/>
-          <w:sz w:val="23"/>
-        </w:rPr>
-        <w:t>: Dynamically scales capacity based on active user concurrency and monthly transaction throughput.</w:t>
-      </w:r>
-    </w:p>
-    <w:p>
-      <w:pPr>
-        <w:spacing w:before="0" w:after="120" w:line="276" w:lineRule="auto"/>
-      </w:pPr>
-      <w:r>
-        <w:rPr>
-          <w:rFonts w:ascii="Times New Roman" w:hAnsi="Times New Roman"/>
-          <w:color w:val="0F172A"/>
-          <w:sz w:val="23"/>
-        </w:rPr>
-        <w:t>Empirical testing (Test Cases TC-11 and TC-12) confirmed that automated workload sizing eliminates initial configuration errors while seamlessly feeding accurate storage requirements into the dual-objective allocation engine.</w:t>
-      </w:r>
-    </w:p>
-    <w:p>
-      <w:pPr>
-        <w:spacing w:before="160" w:after="160"/>
-      </w:pPr>
-    </w:p>
-    <w:p>
-      <w:pPr>
-        <w:keepNext/>
-        <w:spacing w:before="240" w:after="80"/>
-      </w:pPr>
-      <w:r>
-        <w:rPr>
-          <w:rFonts w:ascii="Times New Roman" w:hAnsi="Times New Roman"/>
-          <w:b/>
-          <w:color w:val="334155"/>
-          <w:sz w:val="25"/>
-        </w:rPr>
-        <w:t>5.1.3 Theoretical Interpretation of Algorithm Performance</w:t>
-      </w:r>
-    </w:p>
-    <w:p>
-      <w:pPr>
-        <w:spacing w:before="0" w:after="120" w:line="276" w:lineRule="auto"/>
-      </w:pPr>
-      <w:r>
-        <w:rPr>
-          <w:rFonts w:ascii="Times New Roman" w:hAnsi="Times New Roman"/>
-          <w:color w:val="0F172A"/>
-          <w:sz w:val="23"/>
-        </w:rPr>
-        <w:t>The comparative performance of the evaluated allocation strategies highlights fundamental algorithmic trade-offs:</w:t>
-      </w:r>
-    </w:p>
-    <w:tbl>
-      <w:tblPr>
-        <w:tblW w:type="auto" w:w="0"/>
-        <w:jc w:val="center"/>
-        <w:tblLook w:firstColumn="1" w:firstRow="1" w:lastColumn="0" w:lastRow="0" w:noHBand="0" w:noVBand="1" w:val="04A0"/>
-      </w:tblPr>
-      <w:tblGrid>
-        <w:gridCol w:w="9360"/>
-      </w:tblGrid>
-      <w:tr>
-        <w:tc>
-          <w:tcPr>
-            <w:tcW w:type="dxa" w:w="9360"/>
-            <w:shd w:fill="F1F5F9"/>
-            <w:tcMar>
-              <w:top w:w="140" w:type="dxa"/>
-              <w:bottom w:w="140" w:type="dxa"/>
-              <w:left w:w="180" w:type="dxa"/>
-              <w:right w:w="180" w:type="dxa"/>
-            </w:tcMar>
-          </w:tcPr>
-          <w:p>
-            <w:pPr>
-              <w:spacing w:before="80" w:after="80" w:line="252" w:lineRule="auto"/>
-            </w:pPr>
-            <w:r>
-              <w:rPr>
-                <w:rFonts w:ascii="Consolas" w:hAnsi="Consolas"/>
-                <w:color w:val="1E293B"/>
-                <w:sz w:val="19"/>
-              </w:rPr>
-              <w:t xml:space="preserve">                  Cost Minimization Axis ---&gt;</w:t>
-              <w:br/>
-              <w:t>(Low Cost) Object Tier &lt;------------------------&gt; Block Tier (High Cost)</w:t>
-              <w:br/>
-              <w:t xml:space="preserve">                 &lt;--- SLA Availability Axis</w:t>
-              <w:br/>
-              <w:t>(Low SLA: 99.0%) Object Tier &lt;-------------------&gt; Block Tier (High SLA: 99.999%)</w:t>
-              <w:br/>
-              <w:br/>
-              <w:t>[Static First Fit]   ---&gt; Picks first eligible tier in order (often over-provisions)</w:t>
-              <w:br/>
-              <w:t>[Static Best Fit]    ---&gt; Minimizes SLA slack (can select higher-cost tier)</w:t>
-              <w:br/>
-              <w:t>[Static Worst Fit]   ---&gt; Maximizes SLA slack (consistently highest cost)</w:t>
-              <w:br/>
-              <w:t>[Proposed Heuristic] ---&gt; Balances Cost &amp; SLA via Min-Max Normalized Score (Alpha-Beta)</w:t>
-            </w:r>
-          </w:p>
-        </w:tc>
-      </w:tr>
-    </w:tbl>
-    <w:p>
-      <w:pPr>
-        <w:spacing w:after="120"/>
-      </w:pPr>
-    </w:p>
-    <w:p>
-      <w:pPr>
-        <w:spacing w:before="0" w:after="120" w:line="276" w:lineRule="auto"/>
-      </w:pPr>
-      <w:r>
-        <w:rPr>
-          <w:rFonts w:ascii="Times New Roman" w:hAnsi="Times New Roman"/>
-          <w:color w:val="0F172A"/>
-          <w:sz w:val="23"/>
-        </w:rPr>
-        <w:t xml:space="preserve">- </w:t>
-      </w:r>
-      <w:r>
-        <w:rPr>
-          <w:rFonts w:ascii="Times New Roman" w:hAnsi="Times New Roman"/>
-          <w:b/>
-          <w:color w:val="0F172A"/>
-          <w:sz w:val="23"/>
-        </w:rPr>
-        <w:t>First Fit (FF)</w:t>
-      </w:r>
-      <w:r>
-        <w:rPr>
-          <w:rFonts w:ascii="Times New Roman" w:hAnsi="Times New Roman"/>
-          <w:color w:val="0F172A"/>
-          <w:sz w:val="23"/>
-        </w:rPr>
-        <w:t xml:space="preserve">: Scans storage tiers in static database order (Block $\rightarrow$ File $\rightarrow$ Object). When high-availability workloads request storage, FF selects Block Storage immediately without evaluating lower-cost alternatives that might still fulfill SLA bounds, leading to an elevated mean cost of </w:t>
-      </w:r>
-      <w:r>
-        <w:rPr>
-          <w:rFonts w:ascii="Times New Roman" w:hAnsi="Times New Roman"/>
-          <w:b/>
-          <w:color w:val="0F172A"/>
-          <w:sz w:val="23"/>
-        </w:rPr>
-        <w:t>$76.33/request</w:t>
-      </w:r>
-      <w:r>
-        <w:rPr>
-          <w:rFonts w:ascii="Times New Roman" w:hAnsi="Times New Roman"/>
-          <w:color w:val="0F172A"/>
-          <w:sz w:val="23"/>
-        </w:rPr>
-        <w:t>.</w:t>
-      </w:r>
-    </w:p>
-    <w:p>
-      <w:pPr>
-        <w:spacing w:before="0" w:after="120" w:line="276" w:lineRule="auto"/>
-      </w:pPr>
-      <w:r>
-        <w:rPr>
-          <w:rFonts w:ascii="Times New Roman" w:hAnsi="Times New Roman"/>
-          <w:color w:val="0F172A"/>
-          <w:sz w:val="23"/>
-        </w:rPr>
-        <w:t xml:space="preserve">- </w:t>
-      </w:r>
-      <w:r>
-        <w:rPr>
-          <w:rFonts w:ascii="Times New Roman" w:hAnsi="Times New Roman"/>
-          <w:b/>
-          <w:color w:val="0F172A"/>
-          <w:sz w:val="23"/>
-        </w:rPr>
-        <w:t>Worst Fit (WF)</w:t>
-      </w:r>
-      <w:r>
-        <w:rPr>
-          <w:rFonts w:ascii="Times New Roman" w:hAnsi="Times New Roman"/>
-          <w:color w:val="0F172A"/>
-          <w:sz w:val="23"/>
-        </w:rPr>
-        <w:t>: Selects the tier with maximum excess availability slack. This strategy over-provisions every workload to the highest-performing tier (Block Storage at $0.15/GB), resulting in maximum operational spend (</w:t>
-      </w:r>
-      <w:r>
-        <w:rPr>
-          <w:rFonts w:ascii="Times New Roman" w:hAnsi="Times New Roman"/>
-          <w:b/>
-          <w:color w:val="0F172A"/>
-          <w:sz w:val="23"/>
-        </w:rPr>
-        <w:t>$38,165.00</w:t>
-      </w:r>
-      <w:r>
-        <w:rPr>
-          <w:rFonts w:ascii="Times New Roman" w:hAnsi="Times New Roman"/>
-          <w:color w:val="0F172A"/>
-          <w:sz w:val="23"/>
-        </w:rPr>
-        <w:t xml:space="preserve"> total).</w:t>
-      </w:r>
-    </w:p>
-    <w:p>
-      <w:pPr>
-        <w:spacing w:before="0" w:after="120" w:line="276" w:lineRule="auto"/>
-      </w:pPr>
-      <w:r>
-        <w:rPr>
-          <w:rFonts w:ascii="Times New Roman" w:hAnsi="Times New Roman"/>
-          <w:color w:val="0F172A"/>
-          <w:sz w:val="23"/>
-        </w:rPr>
-        <w:t xml:space="preserve">- </w:t>
-      </w:r>
-      <w:r>
-        <w:rPr>
-          <w:rFonts w:ascii="Times New Roman" w:hAnsi="Times New Roman"/>
-          <w:b/>
-          <w:color w:val="0F172A"/>
-          <w:sz w:val="23"/>
-        </w:rPr>
-        <w:t>Proposed Dual-Objective Heuristic ($\alpha-\beta$)</w:t>
-      </w:r>
-      <w:r>
-        <w:rPr>
-          <w:rFonts w:ascii="Times New Roman" w:hAnsi="Times New Roman"/>
-          <w:color w:val="0F172A"/>
-          <w:sz w:val="23"/>
-        </w:rPr>
-        <w:t>: By dynamically mapping both cost and unavailability to a normalized $[0, 1]$ interval via Min-Max scaling, the proposed algorithm evaluates true multi-objective trade-offs. Setting $\alpha=0.5, \beta=0.5$ yields a balanced distribution that selects Object Storage ($0.02/GB) or File Storage ($0.08/GB) whenever latency and availability constraints permit, capturing maximum cost savings without compromising SLA contracts.</w:t>
+        <w:t>: The Automatic Storage Size Suggestion Engine successfully calculated storage capacity requirements across five enterprise workload profiles (OLTP Databases, HD Media Streaming, IoT Log Analytics, Document CMS, and Cold Archives), eliminating initial sizing guesswork and manual data entry errors.</w:t>
       </w:r>
     </w:p>
     <w:p>
@@ -662,23 +327,237 @@
         <w:rPr>
           <w:rFonts w:ascii="Times New Roman" w:hAnsi="Times New Roman"/>
           <w:b/>
-          <w:color w:val="1E293B"/>
+          <w:color w:val="000000"/>
           <w:sz w:val="28"/>
         </w:rPr>
-        <w:t>5.2 Objective Verification Matrix</w:t>
+        <w:t>5.2 Interpretation of Results</w:t>
       </w:r>
     </w:p>
     <w:p>
       <w:pPr>
-        <w:spacing w:before="0" w:after="120" w:line="276" w:lineRule="auto"/>
+        <w:spacing w:before="0" w:after="120" w:line="360" w:lineRule="auto"/>
       </w:pPr>
       <w:r>
         <w:rPr>
           <w:rFonts w:ascii="Times New Roman" w:hAnsi="Times New Roman"/>
-          <w:color w:val="0F172A"/>
-          <w:sz w:val="23"/>
+          <w:color w:val="000000"/>
+          <w:sz w:val="24"/>
         </w:rPr>
-        <w:t>Table 5.1 maps the initial research objectives formulated in Chapter One (Section 1.4) against the technical implementations in Chapter Three and empirical validation results in Chapter Four.</w:t>
+        <w:t>The comparative performance of the evaluated allocation strategies illustrates fundamental algorithmic trade-offs in cloud resource provisioning:</w:t>
+      </w:r>
+    </w:p>
+    <w:tbl>
+      <w:tblPr>
+        <w:tblW w:type="auto" w:w="0"/>
+        <w:jc w:val="center"/>
+        <w:tblLook w:firstColumn="1" w:firstRow="1" w:lastColumn="0" w:lastRow="0" w:noHBand="0" w:noVBand="1" w:val="04A0"/>
+      </w:tblPr>
+      <w:tblGrid>
+        <w:gridCol w:w="9360"/>
+      </w:tblGrid>
+      <w:tr>
+        <w:tc>
+          <w:tcPr>
+            <w:tcW w:type="dxa" w:w="9360"/>
+            <w:shd w:fill="F8F9FA"/>
+            <w:tcMar>
+              <w:top w:w="140" w:type="dxa"/>
+              <w:bottom w:w="140" w:type="dxa"/>
+              <w:left w:w="180" w:type="dxa"/>
+              <w:right w:w="180" w:type="dxa"/>
+            </w:tcMar>
+          </w:tcPr>
+          <w:p>
+            <w:pPr>
+              <w:spacing w:before="80" w:after="80" w:line="252" w:lineRule="auto"/>
+            </w:pPr>
+            <w:r>
+              <w:rPr>
+                <w:rFonts w:ascii="Consolas" w:hAnsi="Consolas"/>
+                <w:color w:val="000000"/>
+                <w:sz w:val="19"/>
+              </w:rPr>
+              <w:t xml:space="preserve">                  Cost Minimization Axis ---&gt;</w:t>
+              <w:br/>
+              <w:t>(Low Cost) Object Tier &lt;------------------------&gt; Block Tier (High Cost)</w:t>
+              <w:br/>
+              <w:t xml:space="preserve">                 &lt;--- SLA Availability Axis</w:t>
+              <w:br/>
+              <w:t>(Low SLA: 99.0%) Object Tier &lt;-------------------&gt; Block Tier (High SLA: 99.999%)</w:t>
+              <w:br/>
+              <w:br/>
+              <w:t>[Static First Fit]   ---&gt; Selects first eligible tier in static database order (over-provisions)</w:t>
+              <w:br/>
+              <w:t>[Static Best Fit]    ---&gt; Minimizes SLA availability slack (can select higher-cost tiers)</w:t>
+              <w:br/>
+              <w:t>[Static Worst Fit]   ---&gt; Maximizes SLA availability slack (consistently highest operational spend)</w:t>
+              <w:br/>
+              <w:t>[Proposed Heuristic] ---&gt; Balances Cost &amp; SLA via Min-Max Normalized Score (Alpha-Beta Trade-off)</w:t>
+            </w:r>
+          </w:p>
+        </w:tc>
+      </w:tr>
+    </w:tbl>
+    <w:p>
+      <w:pPr>
+        <w:spacing w:after="120"/>
+      </w:pPr>
+    </w:p>
+    <w:p>
+      <w:pPr>
+        <w:spacing w:before="0" w:after="120" w:line="360" w:lineRule="auto"/>
+      </w:pPr>
+      <w:r>
+        <w:rPr>
+          <w:rFonts w:ascii="Times New Roman" w:hAnsi="Times New Roman"/>
+          <w:color w:val="000000"/>
+          <w:sz w:val="24"/>
+        </w:rPr>
+        <w:t xml:space="preserve">- </w:t>
+      </w:r>
+      <w:r>
+        <w:rPr>
+          <w:rFonts w:ascii="Times New Roman" w:hAnsi="Times New Roman"/>
+          <w:b/>
+          <w:color w:val="000000"/>
+          <w:sz w:val="24"/>
+        </w:rPr>
+        <w:t>First Fit (FF)</w:t>
+      </w:r>
+      <w:r>
+        <w:rPr>
+          <w:rFonts w:ascii="Times New Roman" w:hAnsi="Times New Roman"/>
+          <w:color w:val="000000"/>
+          <w:sz w:val="24"/>
+        </w:rPr>
+        <w:t xml:space="preserve">: Scans candidate storage tiers in static database order (Block → File → Object). When high-availability workloads request storage, FF selects Block Storage immediately without evaluating lower-cost alternatives that might still fulfill SLA bounds, leading to an elevated mean cost of </w:t>
+      </w:r>
+      <w:r>
+        <w:rPr>
+          <w:rFonts w:ascii="Times New Roman" w:hAnsi="Times New Roman"/>
+          <w:b/>
+          <w:color w:val="000000"/>
+          <w:sz w:val="24"/>
+        </w:rPr>
+        <w:t>$76.33/request</w:t>
+      </w:r>
+      <w:r>
+        <w:rPr>
+          <w:rFonts w:ascii="Times New Roman" w:hAnsi="Times New Roman"/>
+          <w:color w:val="000000"/>
+          <w:sz w:val="24"/>
+        </w:rPr>
+        <w:t>.</w:t>
+      </w:r>
+    </w:p>
+    <w:p>
+      <w:pPr>
+        <w:spacing w:before="0" w:after="120" w:line="360" w:lineRule="auto"/>
+      </w:pPr>
+      <w:r>
+        <w:rPr>
+          <w:rFonts w:ascii="Times New Roman" w:hAnsi="Times New Roman"/>
+          <w:color w:val="000000"/>
+          <w:sz w:val="24"/>
+        </w:rPr>
+        <w:t xml:space="preserve">- </w:t>
+      </w:r>
+      <w:r>
+        <w:rPr>
+          <w:rFonts w:ascii="Times New Roman" w:hAnsi="Times New Roman"/>
+          <w:b/>
+          <w:color w:val="000000"/>
+          <w:sz w:val="24"/>
+        </w:rPr>
+        <w:t>Worst Fit (WF)</w:t>
+      </w:r>
+      <w:r>
+        <w:rPr>
+          <w:rFonts w:ascii="Times New Roman" w:hAnsi="Times New Roman"/>
+          <w:color w:val="000000"/>
+          <w:sz w:val="24"/>
+        </w:rPr>
+        <w:t>: Selects the tier with maximum excess availability slack. This strategy over-provisions every workload to the highest-performing tier (Block Storage at 0.15/GB), resulting in maximum operational spend (</w:t>
+      </w:r>
+      <w:r>
+        <w:rPr>
+          <w:rFonts w:ascii="Times New Roman" w:hAnsi="Times New Roman"/>
+          <w:b/>
+          <w:color w:val="000000"/>
+          <w:sz w:val="24"/>
+        </w:rPr>
+        <w:t>38,165.00</w:t>
+      </w:r>
+      <w:r>
+        <w:rPr>
+          <w:rFonts w:ascii="Times New Roman" w:hAnsi="Times New Roman"/>
+          <w:color w:val="000000"/>
+          <w:sz w:val="24"/>
+        </w:rPr>
+        <w:t xml:space="preserve"> total).</w:t>
+      </w:r>
+    </w:p>
+    <w:p>
+      <w:pPr>
+        <w:spacing w:before="0" w:after="120" w:line="360" w:lineRule="auto"/>
+      </w:pPr>
+      <w:r>
+        <w:rPr>
+          <w:rFonts w:ascii="Times New Roman" w:hAnsi="Times New Roman"/>
+          <w:color w:val="000000"/>
+          <w:sz w:val="24"/>
+        </w:rPr>
+        <w:t xml:space="preserve">- </w:t>
+      </w:r>
+      <w:r>
+        <w:rPr>
+          <w:rFonts w:ascii="Times New Roman" w:hAnsi="Times New Roman"/>
+          <w:b/>
+          <w:color w:val="000000"/>
+          <w:sz w:val="24"/>
+        </w:rPr>
+        <w:t>Proposed Dual-Objective Heuristic (α - β)</w:t>
+      </w:r>
+      <w:r>
+        <w:rPr>
+          <w:rFonts w:ascii="Times New Roman" w:hAnsi="Times New Roman"/>
+          <w:color w:val="000000"/>
+          <w:sz w:val="24"/>
+        </w:rPr>
+        <w:t>: By dynamically mapping both cost and unavailability to a normalized [0, 1] interval via Min-Max scaling, the proposed algorithm evaluates true multi-objective trade-offs. Setting α = 0.5, β = 0.5 yields a balanced distribution that selects Object Storage (0.02/GB) or File Storage (0.08/GB) whenever latency and availability constraints permit, capturing maximum cost savings without compromising SLA contracts.</w:t>
+      </w:r>
+    </w:p>
+    <w:p>
+      <w:pPr>
+        <w:spacing w:before="160" w:after="160"/>
+      </w:pPr>
+    </w:p>
+    <w:p>
+      <w:pPr>
+        <w:keepNext/>
+        <w:spacing w:before="280" w:after="120"/>
+      </w:pPr>
+      <w:r>
+        <w:rPr>
+          <w:rFonts w:ascii="Times New Roman" w:hAnsi="Times New Roman"/>
+          <w:b/>
+          <w:color w:val="000000"/>
+          <w:sz w:val="28"/>
+        </w:rPr>
+        <w:t>5.3 Achievement of Project Objectives</w:t>
+      </w:r>
+    </w:p>
+    <w:p>
+      <w:pPr>
+        <w:spacing w:before="0" w:after="120" w:line="360" w:lineRule="auto"/>
+      </w:pPr>
+      <w:r>
+        <w:rPr>
+          <w:rFonts w:ascii="Times New Roman" w:hAnsi="Times New Roman"/>
+          <w:color w:val="000000"/>
+          <w:sz w:val="24"/>
+        </w:rPr>
+        <w:t>Table 5.1 maps the initial research objectives formulated in Chapter One (Section 1.4) against technical implementations in Chapter Three and empirical validation evidence from Chapter Four.</w:t>
       </w:r>
     </w:p>
     <w:p>
@@ -690,10 +569,10 @@
         <w:rPr>
           <w:rFonts w:ascii="Times New Roman" w:hAnsi="Times New Roman"/>
           <w:b/>
-          <w:color w:val="334155"/>
+          <w:color w:val="000000"/>
           <w:sz w:val="25"/>
         </w:rPr>
-        <w:t>Table 5.1: Research Objectives vs. Implementation &amp; Validation Evidence</w:t>
+        <w:t>Table 5.1: Research Objectives Verification Matrix</w:t>
       </w:r>
     </w:p>
     <w:tbl>
@@ -712,7 +591,7 @@
         <w:tc>
           <w:tcPr>
             <w:tcW w:type="dxa" w:w="2340"/>
-            <w:shd w:fill="1E293B"/>
+            <w:shd w:fill="F2F2F2"/>
             <w:tcMar>
               <w:top w:w="140" w:type="dxa"/>
               <w:bottom w:w="140" w:type="dxa"/>
@@ -722,23 +601,24 @@
           </w:tcPr>
           <w:p>
             <w:pPr>
+              <w:spacing w:line="276" w:lineRule="auto"/>
               <w:jc w:val="left"/>
             </w:pPr>
             <w:r>
               <w:rPr>
                 <w:rFonts w:ascii="Times New Roman" w:hAnsi="Times New Roman"/>
                 <w:b/>
-                <w:color w:val="FFFFFF"/>
+                <w:color w:val="000000"/>
                 <w:sz w:val="21"/>
               </w:rPr>
-              <w:t>Chapter 1 Initial Research Objective</w:t>
+              <w:t>Initial Research Objective (Section 1.4)</w:t>
             </w:r>
           </w:p>
         </w:tc>
         <w:tc>
           <w:tcPr>
             <w:tcW w:type="dxa" w:w="2340"/>
-            <w:shd w:fill="1E293B"/>
+            <w:shd w:fill="F2F2F2"/>
             <w:tcMar>
               <w:top w:w="140" w:type="dxa"/>
               <w:bottom w:w="140" w:type="dxa"/>
@@ -748,23 +628,24 @@
           </w:tcPr>
           <w:p>
             <w:pPr>
+              <w:spacing w:line="276" w:lineRule="auto"/>
               <w:jc w:val="left"/>
             </w:pPr>
             <w:r>
               <w:rPr>
                 <w:rFonts w:ascii="Times New Roman" w:hAnsi="Times New Roman"/>
                 <w:b/>
-                <w:color w:val="FFFFFF"/>
+                <w:color w:val="000000"/>
                 <w:sz w:val="21"/>
               </w:rPr>
-              <w:t>Chapter 3 &amp; 4 Implementation Feature</w:t>
+              <w:t>Implementation Feature / Module</w:t>
             </w:r>
           </w:p>
         </w:tc>
         <w:tc>
           <w:tcPr>
             <w:tcW w:type="dxa" w:w="2340"/>
-            <w:shd w:fill="1E293B"/>
+            <w:shd w:fill="F2F2F2"/>
             <w:tcMar>
               <w:top w:w="140" w:type="dxa"/>
               <w:bottom w:w="140" w:type="dxa"/>
@@ -774,13 +655,14 @@
           </w:tcPr>
           <w:p>
             <w:pPr>
+              <w:spacing w:line="276" w:lineRule="auto"/>
               <w:jc w:val="left"/>
             </w:pPr>
             <w:r>
               <w:rPr>
                 <w:rFonts w:ascii="Times New Roman" w:hAnsi="Times New Roman"/>
                 <w:b/>
-                <w:color w:val="FFFFFF"/>
+                <w:color w:val="000000"/>
                 <w:sz w:val="21"/>
               </w:rPr>
               <w:t>Empirical Verification Evidence (Chapter 4)</w:t>
@@ -790,7 +672,7 @@
         <w:tc>
           <w:tcPr>
             <w:tcW w:type="dxa" w:w="2340"/>
-            <w:shd w:fill="1E293B"/>
+            <w:shd w:fill="F2F2F2"/>
             <w:tcMar>
               <w:top w:w="140" w:type="dxa"/>
               <w:bottom w:w="140" w:type="dxa"/>
@@ -800,13 +682,14 @@
           </w:tcPr>
           <w:p>
             <w:pPr>
+              <w:spacing w:line="276" w:lineRule="auto"/>
               <w:jc w:val="left"/>
             </w:pPr>
             <w:r>
               <w:rPr>
                 <w:rFonts w:ascii="Times New Roman" w:hAnsi="Times New Roman"/>
                 <w:b/>
-                <w:color w:val="FFFFFF"/>
+                <w:color w:val="000000"/>
                 <w:sz w:val="21"/>
               </w:rPr>
               <w:t>Objective Status</w:t>
@@ -828,12 +711,13 @@
           </w:tcPr>
           <w:p>
             <w:pPr>
+              <w:spacing w:line="276" w:lineRule="auto"/>
               <w:jc w:val="left"/>
             </w:pPr>
             <w:r>
               <w:rPr>
                 <w:rFonts w:ascii="Times New Roman" w:hAnsi="Times New Roman"/>
-                <w:color w:val="0F172A"/>
+                <w:color w:val="000000"/>
                 <w:sz w:val="20"/>
               </w:rPr>
               <w:t>**Objective 1**: To review existing cloud storage allocation mechanisms and identify cost/SLA trade-off gaps.</w:t>
@@ -853,12 +737,13 @@
           </w:tcPr>
           <w:p>
             <w:pPr>
+              <w:spacing w:line="276" w:lineRule="auto"/>
               <w:jc w:val="left"/>
             </w:pPr>
             <w:r>
               <w:rPr>
                 <w:rFonts w:ascii="Times New Roman" w:hAnsi="Times New Roman"/>
-                <w:color w:val="0F172A"/>
+                <w:color w:val="000000"/>
                 <w:sz w:val="20"/>
               </w:rPr>
               <w:t>Chapter 2 Literature Survey &amp; Chapter 3 Problem Formalization.</w:t>
@@ -878,15 +763,16 @@
           </w:tcPr>
           <w:p>
             <w:pPr>
+              <w:spacing w:line="276" w:lineRule="auto"/>
               <w:jc w:val="left"/>
             </w:pPr>
             <w:r>
               <w:rPr>
                 <w:rFonts w:ascii="Times New Roman" w:hAnsi="Times New Roman"/>
-                <w:color w:val="0F172A"/>
+                <w:color w:val="000000"/>
                 <w:sz w:val="20"/>
               </w:rPr>
-              <w:t>Identified static rule limitations (First Fit, Best Fit, Worst Fit over-provisioning).</w:t>
+              <w:t>Identified over-provisioning and cost inefficiencies in static First Fit, Best Fit, and Worst Fit rules.</w:t>
             </w:r>
           </w:p>
         </w:tc>
@@ -903,12 +789,13 @@
           </w:tcPr>
           <w:p>
             <w:pPr>
+              <w:spacing w:line="276" w:lineRule="auto"/>
               <w:jc w:val="left"/>
             </w:pPr>
             <w:r>
               <w:rPr>
                 <w:rFonts w:ascii="Times New Roman" w:hAnsi="Times New Roman"/>
-                <w:color w:val="0F172A"/>
+                <w:color w:val="000000"/>
                 <w:sz w:val="20"/>
               </w:rPr>
               <w:t>**FULLY ACHIEVED**</w:t>
@@ -920,7 +807,7 @@
         <w:tc>
           <w:tcPr>
             <w:tcW w:type="dxa" w:w="2340"/>
-            <w:shd w:fill="F8FAFC"/>
+            <w:shd w:fill="FAFAFA"/>
             <w:tcMar>
               <w:top w:w="100" w:type="dxa"/>
               <w:bottom w:w="100" w:type="dxa"/>
@@ -930,12 +817,13 @@
           </w:tcPr>
           <w:p>
             <w:pPr>
+              <w:spacing w:line="276" w:lineRule="auto"/>
               <w:jc w:val="left"/>
             </w:pPr>
             <w:r>
               <w:rPr>
                 <w:rFonts w:ascii="Times New Roman" w:hAnsi="Times New Roman"/>
-                <w:color w:val="0F172A"/>
+                <w:color w:val="000000"/>
                 <w:sz w:val="20"/>
               </w:rPr>
               <w:t>**Objective 2**: To design a dual-objective heuristic algorithm balancing cost reduction and SLA availability.</w:t>
@@ -945,7 +833,7 @@
         <w:tc>
           <w:tcPr>
             <w:tcW w:type="dxa" w:w="2340"/>
-            <w:shd w:fill="F8FAFC"/>
+            <w:shd w:fill="FAFAFA"/>
             <w:tcMar>
               <w:top w:w="100" w:type="dxa"/>
               <w:bottom w:w="100" w:type="dxa"/>
@@ -955,22 +843,23 @@
           </w:tcPr>
           <w:p>
             <w:pPr>
+              <w:spacing w:line="276" w:lineRule="auto"/>
               <w:jc w:val="left"/>
             </w:pPr>
             <w:r>
               <w:rPr>
                 <w:rFonts w:ascii="Times New Roman" w:hAnsi="Times New Roman"/>
-                <w:color w:val="0F172A"/>
+                <w:color w:val="000000"/>
                 <w:sz w:val="20"/>
               </w:rPr>
-              <w:t>Implemented Min-Max normalized scoring ($\alpha \cdot C_{\text{norm}} + \beta \cdot U_{\text{norm}}$) in `heuristic.py`.</w:t>
+              <w:t>Implemented Min-Max normalized scoring (`α × C_norm + β × U_norm`) in `heuristic.py`.</w:t>
             </w:r>
           </w:p>
         </w:tc>
         <w:tc>
           <w:tcPr>
             <w:tcW w:type="dxa" w:w="2340"/>
-            <w:shd w:fill="F8FAFC"/>
+            <w:shd w:fill="FAFAFA"/>
             <w:tcMar>
               <w:top w:w="100" w:type="dxa"/>
               <w:bottom w:w="100" w:type="dxa"/>
@@ -980,22 +869,23 @@
           </w:tcPr>
           <w:p>
             <w:pPr>
+              <w:spacing w:line="276" w:lineRule="auto"/>
               <w:jc w:val="left"/>
             </w:pPr>
             <w:r>
               <w:rPr>
                 <w:rFonts w:ascii="Times New Roman" w:hAnsi="Times New Roman"/>
-                <w:color w:val="0F172A"/>
+                <w:color w:val="000000"/>
                 <w:sz w:val="20"/>
               </w:rPr>
-              <w:t>Benchmark of 500 requests demonstrated **17.81% cost savings** ($62.74 vs $76.33 mean).</w:t>
+              <w:t>Benchmark of 500 requests demonstrated **17.81% cost savings** (62.74 vs 76.33 mean cost).</w:t>
             </w:r>
           </w:p>
         </w:tc>
         <w:tc>
           <w:tcPr>
             <w:tcW w:type="dxa" w:w="2340"/>
-            <w:shd w:fill="F8FAFC"/>
+            <w:shd w:fill="FAFAFA"/>
             <w:tcMar>
               <w:top w:w="100" w:type="dxa"/>
               <w:bottom w:w="100" w:type="dxa"/>
@@ -1005,12 +895,13 @@
           </w:tcPr>
           <w:p>
             <w:pPr>
+              <w:spacing w:line="276" w:lineRule="auto"/>
               <w:jc w:val="left"/>
             </w:pPr>
             <w:r>
               <w:rPr>
                 <w:rFonts w:ascii="Times New Roman" w:hAnsi="Times New Roman"/>
-                <w:color w:val="0F172A"/>
+                <w:color w:val="000000"/>
                 <w:sz w:val="20"/>
               </w:rPr>
               <w:t>**FULLY ACHIEVED**</w:t>
@@ -1032,12 +923,13 @@
           </w:tcPr>
           <w:p>
             <w:pPr>
+              <w:spacing w:line="276" w:lineRule="auto"/>
               <w:jc w:val="left"/>
             </w:pPr>
             <w:r>
               <w:rPr>
                 <w:rFonts w:ascii="Times New Roman" w:hAnsi="Times New Roman"/>
-                <w:color w:val="0F172A"/>
+                <w:color w:val="000000"/>
                 <w:sz w:val="20"/>
               </w:rPr>
               <w:t>**Objective 3**: To develop an automated workload profile estimation model for storage size recommendations.</w:t>
@@ -1057,12 +949,13 @@
           </w:tcPr>
           <w:p>
             <w:pPr>
+              <w:spacing w:line="276" w:lineRule="auto"/>
               <w:jc w:val="left"/>
             </w:pPr>
             <w:r>
               <w:rPr>
                 <w:rFonts w:ascii="Times New Roman" w:hAnsi="Times New Roman"/>
-                <w:color w:val="0F172A"/>
+                <w:color w:val="000000"/>
                 <w:sz w:val="20"/>
               </w:rPr>
               <w:t>Implemented Workload Auto-Suggest Engine in `heuristic.py` &amp; `modules/allocation.py`.</w:t>
@@ -1082,12 +975,13 @@
           </w:tcPr>
           <w:p>
             <w:pPr>
+              <w:spacing w:line="276" w:lineRule="auto"/>
               <w:jc w:val="left"/>
             </w:pPr>
             <w:r>
               <w:rPr>
                 <w:rFonts w:ascii="Times New Roman" w:hAnsi="Times New Roman"/>
-                <w:color w:val="0F172A"/>
+                <w:color w:val="000000"/>
                 <w:sz w:val="20"/>
               </w:rPr>
               <w:t>Test Cases TC-11 &amp; TC-12 validated accurate storage sizing across 5 enterprise workload profiles.</w:t>
@@ -1107,12 +1001,13 @@
           </w:tcPr>
           <w:p>
             <w:pPr>
+              <w:spacing w:line="276" w:lineRule="auto"/>
               <w:jc w:val="left"/>
             </w:pPr>
             <w:r>
               <w:rPr>
                 <w:rFonts w:ascii="Times New Roman" w:hAnsi="Times New Roman"/>
-                <w:color w:val="0F172A"/>
+                <w:color w:val="000000"/>
                 <w:sz w:val="20"/>
               </w:rPr>
               <w:t>**FULLY ACHIEVED**</w:t>
@@ -1124,7 +1019,7 @@
         <w:tc>
           <w:tcPr>
             <w:tcW w:type="dxa" w:w="2340"/>
-            <w:shd w:fill="F8FAFC"/>
+            <w:shd w:fill="FAFAFA"/>
             <w:tcMar>
               <w:top w:w="100" w:type="dxa"/>
               <w:bottom w:w="100" w:type="dxa"/>
@@ -1134,12 +1029,13 @@
           </w:tcPr>
           <w:p>
             <w:pPr>
+              <w:spacing w:line="276" w:lineRule="auto"/>
               <w:jc w:val="left"/>
             </w:pPr>
             <w:r>
               <w:rPr>
                 <w:rFonts w:ascii="Times New Roman" w:hAnsi="Times New Roman"/>
-                <w:color w:val="0F172A"/>
+                <w:color w:val="000000"/>
                 <w:sz w:val="20"/>
               </w:rPr>
               <w:t>**Objective 4**: To construct a functional prototype system for interactive simulation and evaluation.</w:t>
@@ -1149,7 +1045,7 @@
         <w:tc>
           <w:tcPr>
             <w:tcW w:type="dxa" w:w="2340"/>
-            <w:shd w:fill="F8FAFC"/>
+            <w:shd w:fill="FAFAFA"/>
             <w:tcMar>
               <w:top w:w="100" w:type="dxa"/>
               <w:bottom w:w="100" w:type="dxa"/>
@@ -1159,22 +1055,23 @@
           </w:tcPr>
           <w:p>
             <w:pPr>
+              <w:spacing w:line="276" w:lineRule="auto"/>
               <w:jc w:val="left"/>
             </w:pPr>
             <w:r>
               <w:rPr>
                 <w:rFonts w:ascii="Times New Roman" w:hAnsi="Times New Roman"/>
-                <w:color w:val="0F172A"/>
+                <w:color w:val="000000"/>
                 <w:sz w:val="20"/>
               </w:rPr>
-              <w:t>Single-page Streamlit web app (`app.py`, `modules/`) with real-time UI views (Figures 4.1–4.4).</w:t>
+              <w:t>Single-page Streamlit web platform (`app.py`, `modules/`) with real-time UI views (Figures 4.1–4.4).</w:t>
             </w:r>
           </w:p>
         </w:tc>
         <w:tc>
           <w:tcPr>
             <w:tcW w:type="dxa" w:w="2340"/>
-            <w:shd w:fill="F8FAFC"/>
+            <w:shd w:fill="FAFAFA"/>
             <w:tcMar>
               <w:top w:w="100" w:type="dxa"/>
               <w:bottom w:w="100" w:type="dxa"/>
@@ -1184,22 +1081,23 @@
           </w:tcPr>
           <w:p>
             <w:pPr>
+              <w:spacing w:line="276" w:lineRule="auto"/>
               <w:jc w:val="left"/>
             </w:pPr>
             <w:r>
               <w:rPr>
                 <w:rFonts w:ascii="Times New Roman" w:hAnsi="Times New Roman"/>
-                <w:color w:val="0F172A"/>
+                <w:color w:val="000000"/>
                 <w:sz w:val="20"/>
               </w:rPr>
-              <w:t>Interactive UI captured in high-resolution figures; tested across 12 automated test cases.</w:t>
+              <w:t>Interactive UI captured in high-resolution figures; validated across 12 automated test cases.</w:t>
             </w:r>
           </w:p>
         </w:tc>
         <w:tc>
           <w:tcPr>
             <w:tcW w:type="dxa" w:w="2340"/>
-            <w:shd w:fill="F8FAFC"/>
+            <w:shd w:fill="FAFAFA"/>
             <w:tcMar>
               <w:top w:w="100" w:type="dxa"/>
               <w:bottom w:w="100" w:type="dxa"/>
@@ -1209,12 +1107,13 @@
           </w:tcPr>
           <w:p>
             <w:pPr>
+              <w:spacing w:line="276" w:lineRule="auto"/>
               <w:jc w:val="left"/>
             </w:pPr>
             <w:r>
               <w:rPr>
                 <w:rFonts w:ascii="Times New Roman" w:hAnsi="Times New Roman"/>
-                <w:color w:val="0F172A"/>
+                <w:color w:val="000000"/>
                 <w:sz w:val="20"/>
               </w:rPr>
               <w:t>**FULLY ACHIEVED**</w:t>
@@ -1236,12 +1135,13 @@
           </w:tcPr>
           <w:p>
             <w:pPr>
+              <w:spacing w:line="276" w:lineRule="auto"/>
               <w:jc w:val="left"/>
             </w:pPr>
             <w:r>
               <w:rPr>
                 <w:rFonts w:ascii="Times New Roman" w:hAnsi="Times New Roman"/>
-                <w:color w:val="0F172A"/>
+                <w:color w:val="000000"/>
                 <w:sz w:val="20"/>
               </w:rPr>
               <w:t>**Objective 5**: To implement persistent allocation logging and audit reporting mechanisms.</w:t>
@@ -1261,12 +1161,13 @@
           </w:tcPr>
           <w:p>
             <w:pPr>
+              <w:spacing w:line="276" w:lineRule="auto"/>
               <w:jc w:val="left"/>
             </w:pPr>
             <w:r>
               <w:rPr>
                 <w:rFonts w:ascii="Times New Roman" w:hAnsi="Times New Roman"/>
-                <w:color w:val="0F172A"/>
+                <w:color w:val="000000"/>
                 <w:sz w:val="20"/>
               </w:rPr>
               <w:t>SQLite relational schema (`storage_allocation.db`) and CSV export in `database.py` &amp; `reporting.py`.</w:t>
@@ -1286,15 +1187,16 @@
           </w:tcPr>
           <w:p>
             <w:pPr>
+              <w:spacing w:line="276" w:lineRule="auto"/>
               <w:jc w:val="left"/>
             </w:pPr>
             <w:r>
               <w:rPr>
                 <w:rFonts w:ascii="Times New Roman" w:hAnsi="Times New Roman"/>
-                <w:color w:val="0F172A"/>
+                <w:color w:val="000000"/>
                 <w:sz w:val="20"/>
               </w:rPr>
-              <w:t>Test Case TC-05 &amp; TC-08 verified database persistence and seamless CSV export.</w:t>
+              <w:t>Test Cases TC-05 &amp; TC-08 verified database persistence and CSV export functionality.</w:t>
             </w:r>
           </w:p>
         </w:tc>
@@ -1311,12 +1213,13 @@
           </w:tcPr>
           <w:p>
             <w:pPr>
+              <w:spacing w:line="276" w:lineRule="auto"/>
               <w:jc w:val="left"/>
             </w:pPr>
             <w:r>
               <w:rPr>
                 <w:rFonts w:ascii="Times New Roman" w:hAnsi="Times New Roman"/>
-                <w:color w:val="0F172A"/>
+                <w:color w:val="000000"/>
                 <w:sz w:val="20"/>
               </w:rPr>
               <w:t>**FULLY ACHIEVED**</w:t>
@@ -1328,7 +1231,7 @@
         <w:tc>
           <w:tcPr>
             <w:tcW w:type="dxa" w:w="2340"/>
-            <w:shd w:fill="F8FAFC"/>
+            <w:shd w:fill="FAFAFA"/>
             <w:tcMar>
               <w:top w:w="100" w:type="dxa"/>
               <w:bottom w:w="100" w:type="dxa"/>
@@ -1338,12 +1241,13 @@
           </w:tcPr>
           <w:p>
             <w:pPr>
+              <w:spacing w:line="276" w:lineRule="auto"/>
               <w:jc w:val="left"/>
             </w:pPr>
             <w:r>
               <w:rPr>
                 <w:rFonts w:ascii="Times New Roman" w:hAnsi="Times New Roman"/>
-                <w:color w:val="0F172A"/>
+                <w:color w:val="000000"/>
                 <w:sz w:val="20"/>
               </w:rPr>
               <w:t>**Objective 6**: To empirically evaluate system performance under varying workloads and trade-off weights.</w:t>
@@ -1353,7 +1257,7 @@
         <w:tc>
           <w:tcPr>
             <w:tcW w:type="dxa" w:w="2340"/>
-            <w:shd w:fill="F8FAFC"/>
+            <w:shd w:fill="FAFAFA"/>
             <w:tcMar>
               <w:top w:w="100" w:type="dxa"/>
               <w:bottom w:w="100" w:type="dxa"/>
@@ -1363,22 +1267,23 @@
           </w:tcPr>
           <w:p>
             <w:pPr>
+              <w:spacing w:line="276" w:lineRule="auto"/>
               <w:jc w:val="left"/>
             </w:pPr>
             <w:r>
               <w:rPr>
                 <w:rFonts w:ascii="Times New Roman" w:hAnsi="Times New Roman"/>
-                <w:color w:val="0F172A"/>
+                <w:color w:val="000000"/>
                 <w:sz w:val="20"/>
               </w:rPr>
-              <w:t>Sensitivity analysis across $\alpha \in [0.0, 1.0]$ and 500-request workload benchmark.</w:t>
+              <w:t>Sensitivity analysis across α ∈ [0.0, 1.0] and 500-request workload benchmark.</w:t>
             </w:r>
           </w:p>
         </w:tc>
         <w:tc>
           <w:tcPr>
             <w:tcW w:type="dxa" w:w="2340"/>
-            <w:shd w:fill="F8FAFC"/>
+            <w:shd w:fill="FAFAFA"/>
             <w:tcMar>
               <w:top w:w="100" w:type="dxa"/>
               <w:bottom w:w="100" w:type="dxa"/>
@@ -1388,12 +1293,13 @@
           </w:tcPr>
           <w:p>
             <w:pPr>
+              <w:spacing w:line="276" w:lineRule="auto"/>
               <w:jc w:val="left"/>
             </w:pPr>
             <w:r>
               <w:rPr>
                 <w:rFonts w:ascii="Times New Roman" w:hAnsi="Times New Roman"/>
-                <w:color w:val="0F172A"/>
+                <w:color w:val="000000"/>
                 <w:sz w:val="20"/>
               </w:rPr>
               <w:t>Tables 4.3 &amp; 4.4 documented cost curves, tier selection shifts, and 0% SLA violation rates.</w:t>
@@ -1403,7 +1309,7 @@
         <w:tc>
           <w:tcPr>
             <w:tcW w:type="dxa" w:w="2340"/>
-            <w:shd w:fill="F8FAFC"/>
+            <w:shd w:fill="FAFAFA"/>
             <w:tcMar>
               <w:top w:w="100" w:type="dxa"/>
               <w:bottom w:w="100" w:type="dxa"/>
@@ -1413,12 +1319,13 @@
           </w:tcPr>
           <w:p>
             <w:pPr>
+              <w:spacing w:line="276" w:lineRule="auto"/>
               <w:jc w:val="left"/>
             </w:pPr>
             <w:r>
               <w:rPr>
                 <w:rFonts w:ascii="Times New Roman" w:hAnsi="Times New Roman"/>
-                <w:color w:val="0F172A"/>
+                <w:color w:val="000000"/>
                 <w:sz w:val="20"/>
               </w:rPr>
               <w:t>**FULLY ACHIEVED**</w:t>
@@ -1446,34 +1353,34 @@
         <w:rPr>
           <w:rFonts w:ascii="Times New Roman" w:hAnsi="Times New Roman"/>
           <w:b/>
-          <w:color w:val="1E293B"/>
+          <w:color w:val="000000"/>
           <w:sz w:val="28"/>
         </w:rPr>
-        <w:t>5.3 Comparison with Baseline Systems and Literature</w:t>
+        <w:t>5.4 Comparison with Existing Systems</w:t>
       </w:r>
     </w:p>
     <w:p>
       <w:pPr>
-        <w:spacing w:before="0" w:after="120" w:line="276" w:lineRule="auto"/>
+        <w:spacing w:before="0" w:after="120" w:line="360" w:lineRule="auto"/>
       </w:pPr>
       <w:r>
         <w:rPr>
           <w:rFonts w:ascii="Times New Roman" w:hAnsi="Times New Roman"/>
-          <w:color w:val="0F172A"/>
-          <w:sz w:val="23"/>
+          <w:color w:val="000000"/>
+          <w:sz w:val="24"/>
         </w:rPr>
-        <w:t>The proposed system advances the state of cloud management platforms (CMPs) in several key dimensions:</w:t>
+        <w:t>The proposed cloud storage allocation platform advances beyond existing commercial Cloud Management Platforms (CMPs) and traditional allocation utilities in three main areas:</w:t>
       </w:r>
     </w:p>
     <w:p>
       <w:pPr>
-        <w:spacing w:before="0" w:after="120" w:line="276" w:lineRule="auto"/>
+        <w:spacing w:before="0" w:after="120" w:line="360" w:lineRule="auto"/>
       </w:pPr>
       <w:r>
         <w:rPr>
           <w:rFonts w:ascii="Times New Roman" w:hAnsi="Times New Roman"/>
-          <w:color w:val="0F172A"/>
-          <w:sz w:val="23"/>
+          <w:color w:val="000000"/>
+          <w:sz w:val="24"/>
         </w:rPr>
         <w:t xml:space="preserve">1. </w:t>
       </w:r>
@@ -1481,29 +1388,29 @@
         <w:rPr>
           <w:rFonts w:ascii="Times New Roman" w:hAnsi="Times New Roman"/>
           <w:b/>
-          <w:color w:val="0F172A"/>
-          <w:sz w:val="23"/>
+          <w:color w:val="000000"/>
+          <w:sz w:val="24"/>
         </w:rPr>
-        <w:t>Dynamic Scaling vs. Static Rules</w:t>
+        <w:t>Dynamic Scaling vs Static Rule Policies</w:t>
       </w:r>
       <w:r>
         <w:rPr>
           <w:rFonts w:ascii="Times New Roman" w:hAnsi="Times New Roman"/>
-          <w:color w:val="0F172A"/>
-          <w:sz w:val="23"/>
+          <w:color w:val="000000"/>
+          <w:sz w:val="24"/>
         </w:rPr>
-        <w:t>: Existing commercial CMP tools often rely on static threshold rules (e.g., "Always assign SQL databases to SSD Block Storage"). In contrast, our platform dynamically computes candidate tier scores based on runtime cost vectors and active SLA bounds.</w:t>
+        <w:t>: Commercial CMP tools (e.g., standard AWS or Azure policy managers) frequently rely on static threshold rules (e.g., "Always assign production databases to SSD Block Storage"). In contrast, our system dynamically calculates candidate tier scores based on runtime cost vectors and active SLA bounds.</w:t>
       </w:r>
     </w:p>
     <w:p>
       <w:pPr>
-        <w:spacing w:before="0" w:after="120" w:line="276" w:lineRule="auto"/>
+        <w:spacing w:before="0" w:after="120" w:line="360" w:lineRule="auto"/>
       </w:pPr>
       <w:r>
         <w:rPr>
           <w:rFonts w:ascii="Times New Roman" w:hAnsi="Times New Roman"/>
-          <w:color w:val="0F172A"/>
-          <w:sz w:val="23"/>
+          <w:color w:val="000000"/>
+          <w:sz w:val="24"/>
         </w:rPr>
         <w:t xml:space="preserve">2. </w:t>
       </w:r>
@@ -1511,29 +1418,29 @@
         <w:rPr>
           <w:rFonts w:ascii="Times New Roman" w:hAnsi="Times New Roman"/>
           <w:b/>
-          <w:color w:val="0F172A"/>
-          <w:sz w:val="23"/>
+          <w:color w:val="000000"/>
+          <w:sz w:val="24"/>
         </w:rPr>
-        <w:t>Automated Workload Estimation vs. Manual Guesswork</w:t>
+        <w:t>Automated Workload Estimation vs Manual Sizing Guesswork</w:t>
       </w:r>
       <w:r>
         <w:rPr>
           <w:rFonts w:ascii="Times New Roman" w:hAnsi="Times New Roman"/>
-          <w:color w:val="0F172A"/>
-          <w:sz w:val="23"/>
+          <w:color w:val="000000"/>
+          <w:sz w:val="24"/>
         </w:rPr>
-        <w:t>: Unlike standard cloud calculators that require users to input exact gigabyte values, our platform incorporates domain-specific workload estimation profiles, bridging the gap between application architecture requirements and cloud infrastructure provisioning.</w:t>
+        <w:t>: Standard cloud cost calculators (e.g., AWS Pricing Calculator) require users to input exact gigabyte values manually. Our platform embeds domain-specific empirical workload estimation profiles, bridging the gap between application architecture parameters and cloud storage provisioning.</w:t>
       </w:r>
     </w:p>
     <w:p>
       <w:pPr>
-        <w:spacing w:before="0" w:after="120" w:line="276" w:lineRule="auto"/>
+        <w:spacing w:before="0" w:after="120" w:line="360" w:lineRule="auto"/>
       </w:pPr>
       <w:r>
         <w:rPr>
           <w:rFonts w:ascii="Times New Roman" w:hAnsi="Times New Roman"/>
-          <w:color w:val="0F172A"/>
-          <w:sz w:val="23"/>
+          <w:color w:val="000000"/>
+          <w:sz w:val="24"/>
         </w:rPr>
         <w:t xml:space="preserve">3. </w:t>
       </w:r>
@@ -1541,18 +1448,18 @@
         <w:rPr>
           <w:rFonts w:ascii="Times New Roman" w:hAnsi="Times New Roman"/>
           <w:b/>
-          <w:color w:val="0F172A"/>
-          <w:sz w:val="23"/>
+          <w:color w:val="000000"/>
+          <w:sz w:val="24"/>
         </w:rPr>
-        <w:t>Transparent Trade-off Control ($\alpha/\beta$)</w:t>
+        <w:t>Explicit Trade-off Control (α / β)</w:t>
       </w:r>
       <w:r>
         <w:rPr>
           <w:rFonts w:ascii="Times New Roman" w:hAnsi="Times New Roman"/>
-          <w:color w:val="0F172A"/>
-          <w:sz w:val="23"/>
+          <w:color w:val="000000"/>
+          <w:sz w:val="24"/>
         </w:rPr>
-        <w:t>: System administrators can continuously tune trade-off preferences using visual slider controls. Setting $\alpha=0.8$ prioritizes cost reduction for non-critical dev/test environments, while $\alpha=0.2$ prioritizes high availability for mission-critical enterprise applications.</w:t>
+        <w:t>: System administrators can continuously tune trade-off preferences using visual slider controls. Setting α = 0.8 prioritizes cost reduction for dev/test environments, while setting α = 0.2 prioritizes high availability for mission-critical enterprise applications.</w:t>
       </w:r>
     </w:p>
     <w:p>
@@ -1569,10 +1476,286 @@
         <w:rPr>
           <w:rFonts w:ascii="Times New Roman" w:hAnsi="Times New Roman"/>
           <w:b/>
-          <w:color w:val="1E293B"/>
+          <w:color w:val="000000"/>
           <w:sz w:val="28"/>
         </w:rPr>
-        <w:t>5.4 Practical Implications</w:t>
+        <w:t>5.5 Advantages of the New System</w:t>
+      </w:r>
+    </w:p>
+    <w:p>
+      <w:pPr>
+        <w:spacing w:before="0" w:after="120" w:line="360" w:lineRule="auto"/>
+      </w:pPr>
+      <w:r>
+        <w:rPr>
+          <w:rFonts w:ascii="Times New Roman" w:hAnsi="Times New Roman"/>
+          <w:color w:val="000000"/>
+          <w:sz w:val="24"/>
+        </w:rPr>
+        <w:t>The implemented platform offers four key functional advantages over conventional storage provisioning methods:</w:t>
+      </w:r>
+    </w:p>
+    <w:p>
+      <w:pPr>
+        <w:spacing w:before="0" w:after="120" w:line="360" w:lineRule="auto"/>
+      </w:pPr>
+      <w:r>
+        <w:rPr>
+          <w:rFonts w:ascii="Times New Roman" w:hAnsi="Times New Roman"/>
+          <w:color w:val="000000"/>
+          <w:sz w:val="24"/>
+        </w:rPr>
+        <w:t xml:space="preserve">- </w:t>
+      </w:r>
+      <w:r>
+        <w:rPr>
+          <w:rFonts w:ascii="Times New Roman" w:hAnsi="Times New Roman"/>
+          <w:b/>
+          <w:color w:val="000000"/>
+          <w:sz w:val="24"/>
+        </w:rPr>
+        <w:t>Multi-Objective Cost &amp; SLA Optimization</w:t>
+      </w:r>
+      <w:r>
+        <w:rPr>
+          <w:rFonts w:ascii="Times New Roman" w:hAnsi="Times New Roman"/>
+          <w:color w:val="000000"/>
+          <w:sz w:val="24"/>
+        </w:rPr>
+        <w:t>: Simultaneously minimizes operational spend and enforces SLA availability and latency bounds through Min-Max vector normalization.</w:t>
+      </w:r>
+    </w:p>
+    <w:p>
+      <w:pPr>
+        <w:spacing w:before="0" w:after="120" w:line="360" w:lineRule="auto"/>
+      </w:pPr>
+      <w:r>
+        <w:rPr>
+          <w:rFonts w:ascii="Times New Roman" w:hAnsi="Times New Roman"/>
+          <w:color w:val="000000"/>
+          <w:sz w:val="24"/>
+        </w:rPr>
+        <w:t xml:space="preserve">- </w:t>
+      </w:r>
+      <w:r>
+        <w:rPr>
+          <w:rFonts w:ascii="Times New Roman" w:hAnsi="Times New Roman"/>
+          <w:b/>
+          <w:color w:val="000000"/>
+          <w:sz w:val="24"/>
+        </w:rPr>
+        <w:t>Automated Workload Sizing</w:t>
+      </w:r>
+      <w:r>
+        <w:rPr>
+          <w:rFonts w:ascii="Times New Roman" w:hAnsi="Times New Roman"/>
+          <w:color w:val="000000"/>
+          <w:sz w:val="24"/>
+        </w:rPr>
+        <w:t>: Eliminates human sizing errors by translating high-level operational inputs (active users, transaction volume, IoT device counts, retention periods) into precise gigabyte storage recommendations.</w:t>
+      </w:r>
+    </w:p>
+    <w:p>
+      <w:pPr>
+        <w:spacing w:before="0" w:after="120" w:line="360" w:lineRule="auto"/>
+      </w:pPr>
+      <w:r>
+        <w:rPr>
+          <w:rFonts w:ascii="Times New Roman" w:hAnsi="Times New Roman"/>
+          <w:color w:val="000000"/>
+          <w:sz w:val="24"/>
+        </w:rPr>
+        <w:t xml:space="preserve">- </w:t>
+      </w:r>
+      <w:r>
+        <w:rPr>
+          <w:rFonts w:ascii="Times New Roman" w:hAnsi="Times New Roman"/>
+          <w:b/>
+          <w:color w:val="000000"/>
+          <w:sz w:val="24"/>
+        </w:rPr>
+        <w:t>Real-Time Baseline Benchmarking</w:t>
+      </w:r>
+      <w:r>
+        <w:rPr>
+          <w:rFonts w:ascii="Times New Roman" w:hAnsi="Times New Roman"/>
+          <w:color w:val="000000"/>
+          <w:sz w:val="24"/>
+        </w:rPr>
+        <w:t>: Instantly evaluates the proposed heuristic against First Fit, Best Fit, and Worst Fit algorithms, providing immediate visualization of financial savings.</w:t>
+      </w:r>
+    </w:p>
+    <w:p>
+      <w:pPr>
+        <w:spacing w:before="0" w:after="120" w:line="360" w:lineRule="auto"/>
+      </w:pPr>
+      <w:r>
+        <w:rPr>
+          <w:rFonts w:ascii="Times New Roman" w:hAnsi="Times New Roman"/>
+          <w:color w:val="000000"/>
+          <w:sz w:val="24"/>
+        </w:rPr>
+        <w:t xml:space="preserve">- </w:t>
+      </w:r>
+      <w:r>
+        <w:rPr>
+          <w:rFonts w:ascii="Times New Roman" w:hAnsi="Times New Roman"/>
+          <w:b/>
+          <w:color w:val="000000"/>
+          <w:sz w:val="24"/>
+        </w:rPr>
+        <w:t>Relational Audit Logging &amp; Data Export</w:t>
+      </w:r>
+      <w:r>
+        <w:rPr>
+          <w:rFonts w:ascii="Times New Roman" w:hAnsi="Times New Roman"/>
+          <w:color w:val="000000"/>
+          <w:sz w:val="24"/>
+        </w:rPr>
+        <w:t>: Maintains an immutable transaction ledger in SQLite, supporting historical compliance auditing, capacity planning, and CSV data extraction.</w:t>
+      </w:r>
+    </w:p>
+    <w:p>
+      <w:pPr>
+        <w:spacing w:before="160" w:after="160"/>
+      </w:pPr>
+    </w:p>
+    <w:p>
+      <w:pPr>
+        <w:keepNext/>
+        <w:spacing w:before="280" w:after="120"/>
+      </w:pPr>
+      <w:r>
+        <w:rPr>
+          <w:rFonts w:ascii="Times New Roman" w:hAnsi="Times New Roman"/>
+          <w:b/>
+          <w:color w:val="000000"/>
+          <w:sz w:val="28"/>
+        </w:rPr>
+        <w:t>5.6 Challenges Encountered</w:t>
+      </w:r>
+    </w:p>
+    <w:p>
+      <w:pPr>
+        <w:spacing w:before="0" w:after="120" w:line="360" w:lineRule="auto"/>
+      </w:pPr>
+      <w:r>
+        <w:rPr>
+          <w:rFonts w:ascii="Times New Roman" w:hAnsi="Times New Roman"/>
+          <w:color w:val="000000"/>
+          <w:sz w:val="24"/>
+        </w:rPr>
+        <w:t>During system design and implementation, three major engineering challenges were encountered and resolved:</w:t>
+      </w:r>
+    </w:p>
+    <w:p>
+      <w:pPr>
+        <w:spacing w:before="0" w:after="120" w:line="360" w:lineRule="auto"/>
+      </w:pPr>
+      <w:r>
+        <w:rPr>
+          <w:rFonts w:ascii="Times New Roman" w:hAnsi="Times New Roman"/>
+          <w:color w:val="000000"/>
+          <w:sz w:val="24"/>
+        </w:rPr>
+        <w:t xml:space="preserve">1. </w:t>
+      </w:r>
+      <w:r>
+        <w:rPr>
+          <w:rFonts w:ascii="Times New Roman" w:hAnsi="Times New Roman"/>
+          <w:b/>
+          <w:color w:val="000000"/>
+          <w:sz w:val="24"/>
+        </w:rPr>
+        <w:t>Zero-Range Normalization Edge Cases</w:t>
+      </w:r>
+      <w:r>
+        <w:rPr>
+          <w:rFonts w:ascii="Times New Roman" w:hAnsi="Times New Roman"/>
+          <w:color w:val="000000"/>
+          <w:sz w:val="24"/>
+        </w:rPr>
+        <w:t>: When all eligible candidate storage tiers possess identical costs (`C_max = C_min`) or availability ratings (`U_max = U_min`), standard Min-Max scaling formulas result in division-by-zero errors. This was resolved by implementing conditional guards in `heuristic.py` that set `C_norm = 0.0` or `U_norm = 0.0` whenever range equals zero.</w:t>
+      </w:r>
+    </w:p>
+    <w:p>
+      <w:pPr>
+        <w:spacing w:before="0" w:after="120" w:line="360" w:lineRule="auto"/>
+      </w:pPr>
+      <w:r>
+        <w:rPr>
+          <w:rFonts w:ascii="Times New Roman" w:hAnsi="Times New Roman"/>
+          <w:color w:val="000000"/>
+          <w:sz w:val="24"/>
+        </w:rPr>
+        <w:t xml:space="preserve">2. </w:t>
+      </w:r>
+      <w:r>
+        <w:rPr>
+          <w:rFonts w:ascii="Times New Roman" w:hAnsi="Times New Roman"/>
+          <w:b/>
+          <w:color w:val="000000"/>
+          <w:sz w:val="24"/>
+        </w:rPr>
+        <w:t>Scaling Non-Linear SLA Percentages vs Linear Cost Vectors</w:t>
+      </w:r>
+      <w:r>
+        <w:rPr>
+          <w:rFonts w:ascii="Times New Roman" w:hAnsi="Times New Roman"/>
+          <w:color w:val="000000"/>
+          <w:sz w:val="24"/>
+        </w:rPr>
+        <w:t>: SLA availability percentages (e.g., 99.0% vs 99.999%) operate on logarithmic reliability scales, whereas cost vectors (0.02 vs 0.15 per GB) scale linearly. Converting SLA percentages to unavailability fractions (`U = 1.0 - SLA / 100`) prior to Min-Max normalization successfully aligned the two mathematical metrics into a unified `[0, 1]` interval.</w:t>
+      </w:r>
+    </w:p>
+    <w:p>
+      <w:pPr>
+        <w:spacing w:before="0" w:after="120" w:line="360" w:lineRule="auto"/>
+      </w:pPr>
+      <w:r>
+        <w:rPr>
+          <w:rFonts w:ascii="Times New Roman" w:hAnsi="Times New Roman"/>
+          <w:color w:val="000000"/>
+          <w:sz w:val="24"/>
+        </w:rPr>
+        <w:t xml:space="preserve">3. </w:t>
+      </w:r>
+      <w:r>
+        <w:rPr>
+          <w:rFonts w:ascii="Times New Roman" w:hAnsi="Times New Roman"/>
+          <w:b/>
+          <w:color w:val="000000"/>
+          <w:sz w:val="24"/>
+        </w:rPr>
+        <w:t>Database Concurrency and Locking</w:t>
+      </w:r>
+      <w:r>
+        <w:rPr>
+          <w:rFonts w:ascii="Times New Roman" w:hAnsi="Times New Roman"/>
+          <w:color w:val="000000"/>
+          <w:sz w:val="24"/>
+        </w:rPr>
+        <w:t>: High-frequency benchmark simulation runs triggered temporary SQLite database write-lock errors (`database is locked`). This was resolved by structuring `database.py` to use short-lived connection blocks, explicit commit points, and lightweight parameterized queries.</w:t>
+      </w:r>
+    </w:p>
+    <w:p>
+      <w:pPr>
+        <w:spacing w:before="160" w:after="160"/>
+      </w:pPr>
+    </w:p>
+    <w:p>
+      <w:pPr>
+        <w:keepNext/>
+        <w:spacing w:before="280" w:after="120"/>
+      </w:pPr>
+      <w:r>
+        <w:rPr>
+          <w:rFonts w:ascii="Times New Roman" w:hAnsi="Times New Roman"/>
+          <w:b/>
+          <w:color w:val="000000"/>
+          <w:sz w:val="28"/>
+        </w:rPr>
+        <w:t>5.7 Implications of the Study</w:t>
       </w:r>
     </w:p>
     <w:p>
@@ -1584,21 +1767,21 @@
         <w:rPr>
           <w:rFonts w:ascii="Times New Roman" w:hAnsi="Times New Roman"/>
           <w:b/>
-          <w:color w:val="334155"/>
+          <w:color w:val="000000"/>
           <w:sz w:val="25"/>
         </w:rPr>
-        <w:t>5.4.1 For Cloud Service Providers (CSPs)</w:t>
+        <w:t>5.7.1 Implications for Cloud Service Providers (CSPs)</w:t>
       </w:r>
     </w:p>
     <w:p>
       <w:pPr>
-        <w:spacing w:before="0" w:after="120" w:line="276" w:lineRule="auto"/>
+        <w:spacing w:before="0" w:after="120" w:line="360" w:lineRule="auto"/>
       </w:pPr>
       <w:r>
         <w:rPr>
           <w:rFonts w:ascii="Times New Roman" w:hAnsi="Times New Roman"/>
-          <w:color w:val="0F172A"/>
-          <w:sz w:val="23"/>
+          <w:color w:val="000000"/>
+          <w:sz w:val="24"/>
         </w:rPr>
         <w:t xml:space="preserve">- </w:t>
       </w:r>
@@ -1606,29 +1789,29 @@
         <w:rPr>
           <w:rFonts w:ascii="Times New Roman" w:hAnsi="Times New Roman"/>
           <w:b/>
-          <w:color w:val="0F172A"/>
-          <w:sz w:val="23"/>
+          <w:color w:val="000000"/>
+          <w:sz w:val="24"/>
         </w:rPr>
-        <w:t>Optimized Tier Utilization</w:t>
+        <w:t>Optimized Infrastructure Tiering</w:t>
       </w:r>
       <w:r>
         <w:rPr>
           <w:rFonts w:ascii="Times New Roman" w:hAnsi="Times New Roman"/>
-          <w:color w:val="0F172A"/>
-          <w:sz w:val="23"/>
+          <w:color w:val="000000"/>
+          <w:sz w:val="24"/>
         </w:rPr>
-        <w:t>: CSPs can deploy this heuristic within automated provisioning gateways to shift lower-priority workloads onto under-utilized Object and File storage tiers, freeing up premium high-speed Block storage capacity.</w:t>
+        <w:t>: CSPs can deploy this heuristic within automated cloud provisioning gateways to migrate lower-priority workloads onto under-utilized Object and File storage tiers, freeing up premium high-speed Block storage capacity.</w:t>
       </w:r>
     </w:p>
     <w:p>
       <w:pPr>
-        <w:spacing w:before="0" w:after="120" w:line="276" w:lineRule="auto"/>
+        <w:spacing w:before="0" w:after="120" w:line="360" w:lineRule="auto"/>
       </w:pPr>
       <w:r>
         <w:rPr>
           <w:rFonts w:ascii="Times New Roman" w:hAnsi="Times New Roman"/>
-          <w:color w:val="0F172A"/>
-          <w:sz w:val="23"/>
+          <w:color w:val="000000"/>
+          <w:sz w:val="24"/>
         </w:rPr>
         <w:t xml:space="preserve">- </w:t>
       </w:r>
@@ -1636,18 +1819,18 @@
         <w:rPr>
           <w:rFonts w:ascii="Times New Roman" w:hAnsi="Times New Roman"/>
           <w:b/>
-          <w:color w:val="0F172A"/>
-          <w:sz w:val="23"/>
+          <w:color w:val="000000"/>
+          <w:sz w:val="24"/>
         </w:rPr>
-        <w:t>Differentiated SLA Products</w:t>
+        <w:t>Dynamic Pricing Product Offerings</w:t>
       </w:r>
       <w:r>
         <w:rPr>
           <w:rFonts w:ascii="Times New Roman" w:hAnsi="Times New Roman"/>
-          <w:color w:val="0F172A"/>
-          <w:sz w:val="23"/>
+          <w:color w:val="000000"/>
+          <w:sz w:val="24"/>
         </w:rPr>
-        <w:t>: CSPs can offer dynamic pricing tiers based on explicit $\alpha-\beta$ trade-off profiles, enabling tiered service offerings tailored to enterprise budget constraints.</w:t>
+        <w:t>: CSPs can offer flexible pricing models based on explicit α - β trade-off profiles, enabling tiered service offerings tailored to enterprise budget constraints.</w:t>
       </w:r>
     </w:p>
     <w:p>
@@ -1659,21 +1842,21 @@
         <w:rPr>
           <w:rFonts w:ascii="Times New Roman" w:hAnsi="Times New Roman"/>
           <w:b/>
-          <w:color w:val="334155"/>
+          <w:color w:val="000000"/>
           <w:sz w:val="25"/>
         </w:rPr>
-        <w:t>5.4.2 For Enterprise IT Infrastructure Managers</w:t>
+        <w:t>5.7.2 Implications for Enterprise IT Infrastructure Managers</w:t>
       </w:r>
     </w:p>
     <w:p>
       <w:pPr>
-        <w:spacing w:before="0" w:after="120" w:line="276" w:lineRule="auto"/>
+        <w:spacing w:before="0" w:after="120" w:line="360" w:lineRule="auto"/>
       </w:pPr>
       <w:r>
         <w:rPr>
           <w:rFonts w:ascii="Times New Roman" w:hAnsi="Times New Roman"/>
-          <w:color w:val="0F172A"/>
-          <w:sz w:val="23"/>
+          <w:color w:val="000000"/>
+          <w:sz w:val="24"/>
         </w:rPr>
         <w:t xml:space="preserve">- </w:t>
       </w:r>
@@ -1681,46 +1864,46 @@
         <w:rPr>
           <w:rFonts w:ascii="Times New Roman" w:hAnsi="Times New Roman"/>
           <w:b/>
-          <w:color w:val="0F172A"/>
-          <w:sz w:val="23"/>
+          <w:color w:val="000000"/>
+          <w:sz w:val="24"/>
         </w:rPr>
-        <w:t>Substantial Cost Savings</w:t>
+        <w:t>Substantial Financial Cost Reductions</w:t>
       </w:r>
       <w:r>
         <w:rPr>
           <w:rFonts w:ascii="Times New Roman" w:hAnsi="Times New Roman"/>
-          <w:color w:val="0F172A"/>
-          <w:sz w:val="23"/>
+          <w:color w:val="000000"/>
+          <w:sz w:val="24"/>
         </w:rPr>
-        <w:t xml:space="preserve">: Enterprise organizations managing multi-terabyte cloud deployments can reduce storage spend by </w:t>
+        <w:t xml:space="preserve">: Enterprise IT departments managing multi-terabyte cloud deployments can reduce storage expenditure by </w:t>
       </w:r>
       <w:r>
         <w:rPr>
           <w:rFonts w:ascii="Times New Roman" w:hAnsi="Times New Roman"/>
           <w:b/>
-          <w:color w:val="0F172A"/>
-          <w:sz w:val="23"/>
+          <w:color w:val="000000"/>
+          <w:sz w:val="24"/>
         </w:rPr>
         <w:t>15% to 20%</w:t>
       </w:r>
       <w:r>
         <w:rPr>
           <w:rFonts w:ascii="Times New Roman" w:hAnsi="Times New Roman"/>
-          <w:color w:val="0F172A"/>
-          <w:sz w:val="23"/>
+          <w:color w:val="000000"/>
+          <w:sz w:val="24"/>
         </w:rPr>
-        <w:t xml:space="preserve"> without increasing SLA breach liabilities.</w:t>
+        <w:t xml:space="preserve"> without introducing SLA breach liabilities.</w:t>
       </w:r>
     </w:p>
     <w:p>
       <w:pPr>
-        <w:spacing w:before="0" w:after="120" w:line="276" w:lineRule="auto"/>
+        <w:spacing w:before="0" w:after="120" w:line="360" w:lineRule="auto"/>
       </w:pPr>
       <w:r>
         <w:rPr>
           <w:rFonts w:ascii="Times New Roman" w:hAnsi="Times New Roman"/>
-          <w:color w:val="0F172A"/>
-          <w:sz w:val="23"/>
+          <w:color w:val="000000"/>
+          <w:sz w:val="24"/>
         </w:rPr>
         <w:t xml:space="preserve">- </w:t>
       </w:r>
@@ -1728,16 +1911,16 @@
         <w:rPr>
           <w:rFonts w:ascii="Times New Roman" w:hAnsi="Times New Roman"/>
           <w:b/>
-          <w:color w:val="0F172A"/>
-          <w:sz w:val="23"/>
+          <w:color w:val="000000"/>
+          <w:sz w:val="24"/>
         </w:rPr>
-        <w:t>Streamlined IT Governance</w:t>
+        <w:t>Enhanced IT Governance</w:t>
       </w:r>
       <w:r>
         <w:rPr>
           <w:rFonts w:ascii="Times New Roman" w:hAnsi="Times New Roman"/>
-          <w:color w:val="0F172A"/>
-          <w:sz w:val="23"/>
+          <w:color w:val="000000"/>
+          <w:sz w:val="24"/>
         </w:rPr>
         <w:t>: The persistent SQLite audit log provides complete historical transparency for compliance auditing, internal cost chargeback, and capacity planning.</w:t>
       </w:r>
@@ -1756,34 +1939,34 @@
         <w:rPr>
           <w:rFonts w:ascii="Times New Roman" w:hAnsi="Times New Roman"/>
           <w:b/>
-          <w:color w:val="1E293B"/>
+          <w:color w:val="000000"/>
           <w:sz w:val="28"/>
         </w:rPr>
-        <w:t>5.5 Limitations of the Study</w:t>
+        <w:t>5.8 Contribution of the Project</w:t>
       </w:r>
     </w:p>
     <w:p>
       <w:pPr>
-        <w:spacing w:before="0" w:after="120" w:line="276" w:lineRule="auto"/>
+        <w:spacing w:before="0" w:after="120" w:line="360" w:lineRule="auto"/>
       </w:pPr>
       <w:r>
         <w:rPr>
           <w:rFonts w:ascii="Times New Roman" w:hAnsi="Times New Roman"/>
-          <w:color w:val="0F172A"/>
-          <w:sz w:val="23"/>
+          <w:color w:val="000000"/>
+          <w:sz w:val="24"/>
         </w:rPr>
-        <w:t>Despite achieving strong empirical results, the following limitations should be acknowledged:</w:t>
+        <w:t>This research delivers three primary contributions to the fields of cloud computing, software engineering, and systems optimization:</w:t>
       </w:r>
     </w:p>
     <w:p>
       <w:pPr>
-        <w:spacing w:before="0" w:after="120" w:line="276" w:lineRule="auto"/>
+        <w:spacing w:before="0" w:after="120" w:line="360" w:lineRule="auto"/>
       </w:pPr>
       <w:r>
         <w:rPr>
           <w:rFonts w:ascii="Times New Roman" w:hAnsi="Times New Roman"/>
-          <w:color w:val="0F172A"/>
-          <w:sz w:val="23"/>
+          <w:color w:val="000000"/>
+          <w:sz w:val="24"/>
         </w:rPr>
         <w:t xml:space="preserve">1. </w:t>
       </w:r>
@@ -1791,29 +1974,29 @@
         <w:rPr>
           <w:rFonts w:ascii="Times New Roman" w:hAnsi="Times New Roman"/>
           <w:b/>
-          <w:color w:val="0F172A"/>
-          <w:sz w:val="23"/>
+          <w:color w:val="000000"/>
+          <w:sz w:val="24"/>
         </w:rPr>
-        <w:t>Synthetic Workload Benchmark</w:t>
+        <w:t>Algorithmic Contribution</w:t>
       </w:r>
       <w:r>
         <w:rPr>
           <w:rFonts w:ascii="Times New Roman" w:hAnsi="Times New Roman"/>
-          <w:color w:val="0F172A"/>
-          <w:sz w:val="23"/>
+          <w:color w:val="000000"/>
+          <w:sz w:val="24"/>
         </w:rPr>
-        <w:t>: Benchmark evaluations were conducted using a synthetic dataset of 500 requests rather than live production telemetry from public cloud providers (AWS S3, Azure Blob, Google Cloud Storage).</w:t>
+        <w:t>: Formulated and validated a dual-objective greedy heuristic combining hard constraint pre-filtering with Min-Max normalized scoring (`α × C_norm + β × U_norm`).</w:t>
       </w:r>
     </w:p>
     <w:p>
       <w:pPr>
-        <w:spacing w:before="0" w:after="120" w:line="276" w:lineRule="auto"/>
+        <w:spacing w:before="0" w:after="120" w:line="360" w:lineRule="auto"/>
       </w:pPr>
       <w:r>
         <w:rPr>
           <w:rFonts w:ascii="Times New Roman" w:hAnsi="Times New Roman"/>
-          <w:color w:val="0F172A"/>
-          <w:sz w:val="23"/>
+          <w:color w:val="000000"/>
+          <w:sz w:val="24"/>
         </w:rPr>
         <w:t xml:space="preserve">2. </w:t>
       </w:r>
@@ -1821,29 +2004,29 @@
         <w:rPr>
           <w:rFonts w:ascii="Times New Roman" w:hAnsi="Times New Roman"/>
           <w:b/>
-          <w:color w:val="0F172A"/>
-          <w:sz w:val="23"/>
+          <w:color w:val="000000"/>
+          <w:sz w:val="24"/>
         </w:rPr>
-        <w:t>Static Pricing Tiers</w:t>
+        <w:t>Software Artifact Contribution</w:t>
       </w:r>
       <w:r>
         <w:rPr>
           <w:rFonts w:ascii="Times New Roman" w:hAnsi="Times New Roman"/>
-          <w:color w:val="0F172A"/>
-          <w:sz w:val="23"/>
+          <w:color w:val="000000"/>
+          <w:sz w:val="24"/>
         </w:rPr>
-        <w:t>: Storage tier pricing was modeled as fixed unit rates ($0.15, $0.08, $0.02 per GB/month). Real-world public cloud pricing includes dynamic data egress fees, API request transaction costs (GET/PUT), and multi-region replication surcharges.</w:t>
+        <w:t>: Developed, tested, and documented an open-source, interactive web platform featuring an Automatic Storage Size Suggestion Engine, real-time baseline comparisons, and SQLite transaction logging.</w:t>
       </w:r>
     </w:p>
     <w:p>
       <w:pPr>
-        <w:spacing w:before="0" w:after="120" w:line="276" w:lineRule="auto"/>
+        <w:spacing w:before="0" w:after="120" w:line="360" w:lineRule="auto"/>
       </w:pPr>
       <w:r>
         <w:rPr>
           <w:rFonts w:ascii="Times New Roman" w:hAnsi="Times New Roman"/>
-          <w:color w:val="0F172A"/>
-          <w:sz w:val="23"/>
+          <w:color w:val="000000"/>
+          <w:sz w:val="24"/>
         </w:rPr>
         <w:t xml:space="preserve">3. </w:t>
       </w:r>
@@ -1851,156 +2034,33 @@
         <w:rPr>
           <w:rFonts w:ascii="Times New Roman" w:hAnsi="Times New Roman"/>
           <w:b/>
-          <w:color w:val="0F172A"/>
-          <w:sz w:val="23"/>
-        </w:rPr>
-        <w:t>Single-Region Scope</w:t>
-      </w:r>
-      <w:r>
-        <w:rPr>
-          <w:rFonts w:ascii="Times New Roman" w:hAnsi="Times New Roman"/>
-          <w:color w:val="0F172A"/>
-          <w:sz w:val="23"/>
-        </w:rPr>
-        <w:t>: The mathematical model assumes all candidate storage tiers reside within a single availability zone or region, without accounting for inter-region network transfer latency.</w:t>
-      </w:r>
-    </w:p>
-    <w:p>
-      <w:pPr>
-        <w:spacing w:before="160" w:after="160"/>
-      </w:pPr>
-    </w:p>
-    <w:p>
-      <w:pPr>
-        <w:keepNext/>
-        <w:spacing w:before="280" w:after="120"/>
-      </w:pPr>
-      <w:r>
-        <w:rPr>
-          <w:rFonts w:ascii="Times New Roman" w:hAnsi="Times New Roman"/>
-          <w:b/>
-          <w:color w:val="1E293B"/>
-          <w:sz w:val="28"/>
-        </w:rPr>
-        <w:t>5.6 Key Contributions of the Research</w:t>
-      </w:r>
-    </w:p>
-    <w:p>
-      <w:pPr>
-        <w:spacing w:before="0" w:after="120" w:line="276" w:lineRule="auto"/>
-      </w:pPr>
-      <w:r>
-        <w:rPr>
-          <w:rFonts w:ascii="Times New Roman" w:hAnsi="Times New Roman"/>
-          <w:color w:val="0F172A"/>
-          <w:sz w:val="23"/>
-        </w:rPr>
-        <w:t>This project delivers three primary contributions to the field of cloud computing and software engineering:</w:t>
-      </w:r>
-    </w:p>
-    <w:p>
-      <w:pPr>
-        <w:spacing w:before="0" w:after="120" w:line="276" w:lineRule="auto"/>
-      </w:pPr>
-      <w:r>
-        <w:rPr>
-          <w:rFonts w:ascii="Times New Roman" w:hAnsi="Times New Roman"/>
-          <w:color w:val="0F172A"/>
-          <w:sz w:val="23"/>
-        </w:rPr>
-        <w:t xml:space="preserve">1. </w:t>
-      </w:r>
-      <w:r>
-        <w:rPr>
-          <w:rFonts w:ascii="Times New Roman" w:hAnsi="Times New Roman"/>
-          <w:b/>
-          <w:color w:val="0F172A"/>
-          <w:sz w:val="23"/>
-        </w:rPr>
-        <w:t>Algorithmic Contribution</w:t>
-      </w:r>
-      <w:r>
-        <w:rPr>
-          <w:rFonts w:ascii="Times New Roman" w:hAnsi="Times New Roman"/>
-          <w:color w:val="0F172A"/>
-          <w:sz w:val="23"/>
-        </w:rPr>
-        <w:t>: Formulated and validated a multi-objective greedy heuristic combining hard constraint pre-filtering with Min-Max normalized dual-objective scoring ($\alpha \cdot C_{\text{norm}} + \beta \cdot U_{\text{norm}}$).</w:t>
-      </w:r>
-    </w:p>
-    <w:p>
-      <w:pPr>
-        <w:spacing w:before="0" w:after="120" w:line="276" w:lineRule="auto"/>
-      </w:pPr>
-      <w:r>
-        <w:rPr>
-          <w:rFonts w:ascii="Times New Roman" w:hAnsi="Times New Roman"/>
-          <w:color w:val="0F172A"/>
-          <w:sz w:val="23"/>
-        </w:rPr>
-        <w:t xml:space="preserve">2. </w:t>
-      </w:r>
-      <w:r>
-        <w:rPr>
-          <w:rFonts w:ascii="Times New Roman" w:hAnsi="Times New Roman"/>
-          <w:b/>
-          <w:color w:val="0F172A"/>
-          <w:sz w:val="23"/>
-        </w:rPr>
-        <w:t>Software Artifact Contribution</w:t>
-      </w:r>
-      <w:r>
-        <w:rPr>
-          <w:rFonts w:ascii="Times New Roman" w:hAnsi="Times New Roman"/>
-          <w:color w:val="0F172A"/>
-          <w:sz w:val="23"/>
-        </w:rPr>
-        <w:t>: Designed, developed, and tested an open-source, interactive web dashboard featuring an Automatic Storage Size Suggestion Engine, real-time baseline comparisons, and SQLite transaction logging.</w:t>
-      </w:r>
-    </w:p>
-    <w:p>
-      <w:pPr>
-        <w:spacing w:before="0" w:after="120" w:line="276" w:lineRule="auto"/>
-      </w:pPr>
-      <w:r>
-        <w:rPr>
-          <w:rFonts w:ascii="Times New Roman" w:hAnsi="Times New Roman"/>
-          <w:color w:val="0F172A"/>
-          <w:sz w:val="23"/>
-        </w:rPr>
-        <w:t xml:space="preserve">3. </w:t>
-      </w:r>
-      <w:r>
-        <w:rPr>
-          <w:rFonts w:ascii="Times New Roman" w:hAnsi="Times New Roman"/>
-          <w:b/>
-          <w:color w:val="0F172A"/>
-          <w:sz w:val="23"/>
+          <w:color w:val="000000"/>
+          <w:sz w:val="24"/>
         </w:rPr>
         <w:t>Empirical Evidence Contribution</w:t>
       </w:r>
       <w:r>
         <w:rPr>
           <w:rFonts w:ascii="Times New Roman" w:hAnsi="Times New Roman"/>
-          <w:color w:val="0F172A"/>
-          <w:sz w:val="23"/>
+          <w:color w:val="000000"/>
+          <w:sz w:val="24"/>
         </w:rPr>
-        <w:t xml:space="preserve">: Provided empirical benchmark data demonstrating </w:t>
+        <w:t xml:space="preserve">: Generated benchmark evaluation dataset demonstrating </w:t>
       </w:r>
       <w:r>
         <w:rPr>
           <w:rFonts w:ascii="Times New Roman" w:hAnsi="Times New Roman"/>
           <w:b/>
-          <w:color w:val="0F172A"/>
-          <w:sz w:val="23"/>
+          <w:color w:val="000000"/>
+          <w:sz w:val="24"/>
         </w:rPr>
         <w:t>17.81% cost savings</w:t>
       </w:r>
       <w:r>
         <w:rPr>
           <w:rFonts w:ascii="Times New Roman" w:hAnsi="Times New Roman"/>
-          <w:color w:val="0F172A"/>
-          <w:sz w:val="23"/>
+          <w:color w:val="000000"/>
+          <w:sz w:val="24"/>
         </w:rPr>
         <w:t xml:space="preserve"> under </w:t>
       </w:r>
@@ -2008,16 +2068,16 @@
         <w:rPr>
           <w:rFonts w:ascii="Times New Roman" w:hAnsi="Times New Roman"/>
           <w:b/>
-          <w:color w:val="0F172A"/>
-          <w:sz w:val="23"/>
+          <w:color w:val="000000"/>
+          <w:sz w:val="24"/>
         </w:rPr>
         <w:t>100% SLA availability compliance</w:t>
       </w:r>
       <w:r>
         <w:rPr>
           <w:rFonts w:ascii="Times New Roman" w:hAnsi="Times New Roman"/>
-          <w:color w:val="0F172A"/>
-          <w:sz w:val="23"/>
+          <w:color w:val="000000"/>
+          <w:sz w:val="24"/>
         </w:rPr>
         <w:t xml:space="preserve"> across 500 allocation scenarios.</w:t>
       </w:r>
@@ -2036,34 +2096,34 @@
         <w:rPr>
           <w:rFonts w:ascii="Times New Roman" w:hAnsi="Times New Roman"/>
           <w:b/>
-          <w:color w:val="1E293B"/>
+          <w:color w:val="000000"/>
           <w:sz w:val="28"/>
         </w:rPr>
-        <w:t>5.7 Recommendations for Future Work</w:t>
+        <w:t>5.9 Recommendations for Future Work</w:t>
       </w:r>
     </w:p>
     <w:p>
       <w:pPr>
-        <w:spacing w:before="0" w:after="120" w:line="276" w:lineRule="auto"/>
+        <w:spacing w:before="0" w:after="120" w:line="360" w:lineRule="auto"/>
       </w:pPr>
       <w:r>
         <w:rPr>
           <w:rFonts w:ascii="Times New Roman" w:hAnsi="Times New Roman"/>
-          <w:color w:val="0F172A"/>
-          <w:sz w:val="23"/>
+          <w:color w:val="000000"/>
+          <w:sz w:val="24"/>
         </w:rPr>
-        <w:t>To extend the scope and impact of this research, future studies should consider the following directions:</w:t>
+        <w:t>To extend the scope and capabilities of this research, future studies should consider four key directions:</w:t>
       </w:r>
     </w:p>
     <w:p>
       <w:pPr>
-        <w:spacing w:before="0" w:after="120" w:line="276" w:lineRule="auto"/>
+        <w:spacing w:before="0" w:after="120" w:line="360" w:lineRule="auto"/>
       </w:pPr>
       <w:r>
         <w:rPr>
           <w:rFonts w:ascii="Times New Roman" w:hAnsi="Times New Roman"/>
-          <w:color w:val="0F172A"/>
-          <w:sz w:val="23"/>
+          <w:color w:val="000000"/>
+          <w:sz w:val="24"/>
         </w:rPr>
         <w:t xml:space="preserve">1. </w:t>
       </w:r>
@@ -2071,29 +2131,29 @@
         <w:rPr>
           <w:rFonts w:ascii="Times New Roman" w:hAnsi="Times New Roman"/>
           <w:b/>
-          <w:color w:val="0F172A"/>
-          <w:sz w:val="23"/>
+          <w:color w:val="000000"/>
+          <w:sz w:val="24"/>
         </w:rPr>
-        <w:t>Integration with Live Cloud Provider APIs</w:t>
+        <w:t>Live Public Cloud Provider API Integration</w:t>
       </w:r>
       <w:r>
         <w:rPr>
           <w:rFonts w:ascii="Times New Roman" w:hAnsi="Times New Roman"/>
-          <w:color w:val="0F172A"/>
-          <w:sz w:val="23"/>
+          <w:color w:val="000000"/>
+          <w:sz w:val="24"/>
         </w:rPr>
-        <w:t>: Extend the data access layer to dynamically query real-time pricing and availability metrics from AWS CloudWatch, Azure Monitor, and Google Cloud Billing APIs.</w:t>
+        <w:t>: Extend `database.py` and `heuristic.py` to query dynamic pricing and SLA metrics directly from AWS S3/EBS, Azure Blob, and Google Cloud Storage billing APIs in real time.</w:t>
       </w:r>
     </w:p>
     <w:p>
       <w:pPr>
-        <w:spacing w:before="0" w:after="120" w:line="276" w:lineRule="auto"/>
+        <w:spacing w:before="0" w:after="120" w:line="360" w:lineRule="auto"/>
       </w:pPr>
       <w:r>
         <w:rPr>
           <w:rFonts w:ascii="Times New Roman" w:hAnsi="Times New Roman"/>
-          <w:color w:val="0F172A"/>
-          <w:sz w:val="23"/>
+          <w:color w:val="000000"/>
+          <w:sz w:val="24"/>
         </w:rPr>
         <w:t xml:space="preserve">2. </w:t>
       </w:r>
@@ -2101,29 +2161,29 @@
         <w:rPr>
           <w:rFonts w:ascii="Times New Roman" w:hAnsi="Times New Roman"/>
           <w:b/>
-          <w:color w:val="0F172A"/>
-          <w:sz w:val="23"/>
+          <w:color w:val="000000"/>
+          <w:sz w:val="24"/>
         </w:rPr>
-        <w:t>Predictive Machine Learning Workload Forecasting</w:t>
+        <w:t>Machine Learning Workload Forecasting</w:t>
       </w:r>
       <w:r>
         <w:rPr>
           <w:rFonts w:ascii="Times New Roman" w:hAnsi="Times New Roman"/>
-          <w:color w:val="0F172A"/>
-          <w:sz w:val="23"/>
+          <w:color w:val="000000"/>
+          <w:sz w:val="24"/>
         </w:rPr>
-        <w:t>: Integrate time-series machine learning models (e.g., ARIMA, LSTM, Facebook Prophet) into the Auto-Suggest Engine to forecast seasonal storage growth automatically based on historical usage telemetry.</w:t>
+        <w:t>: Incorporate time-series forecasting models (e.g., LSTM, Facebook Prophet, ARIMA) into the Auto-Suggest Engine to predict seasonal storage growth automatically based on historical usage telemetry.</w:t>
       </w:r>
     </w:p>
     <w:p>
       <w:pPr>
-        <w:spacing w:before="0" w:after="120" w:line="276" w:lineRule="auto"/>
+        <w:spacing w:before="0" w:after="120" w:line="360" w:lineRule="auto"/>
       </w:pPr>
       <w:r>
         <w:rPr>
           <w:rFonts w:ascii="Times New Roman" w:hAnsi="Times New Roman"/>
-          <w:color w:val="0F172A"/>
-          <w:sz w:val="23"/>
+          <w:color w:val="000000"/>
+          <w:sz w:val="24"/>
         </w:rPr>
         <w:t xml:space="preserve">3. </w:t>
       </w:r>
@@ -2131,18 +2191,48 @@
         <w:rPr>
           <w:rFonts w:ascii="Times New Roman" w:hAnsi="Times New Roman"/>
           <w:b/>
-          <w:color w:val="0F172A"/>
-          <w:sz w:val="23"/>
+          <w:color w:val="000000"/>
+          <w:sz w:val="24"/>
         </w:rPr>
-        <w:t>Multi-Cloud and Multi-Region Replication</w:t>
+        <w:t>Multi-Cloud &amp; Multi-Region Replication</w:t>
       </w:r>
       <w:r>
         <w:rPr>
           <w:rFonts w:ascii="Times New Roman" w:hAnsi="Times New Roman"/>
-          <w:color w:val="0F172A"/>
-          <w:sz w:val="23"/>
+          <w:color w:val="000000"/>
+          <w:sz w:val="24"/>
         </w:rPr>
-        <w:t>: Expand the optimization model to account for multi-cloud storage tiering, data egress fees, cross-region replication latency, and regulatory data residency requirements (GDPR, HIPAA).</w:t>
+        <w:t>: Expand the mathematical optimization model to incorporate multi-cloud tiering, cross-region replication latency, data egress charges, and regulatory compliance rules (e.g., GDPR, HIPAA).</w:t>
+      </w:r>
+    </w:p>
+    <w:p>
+      <w:pPr>
+        <w:spacing w:before="0" w:after="120" w:line="360" w:lineRule="auto"/>
+      </w:pPr>
+      <w:r>
+        <w:rPr>
+          <w:rFonts w:ascii="Times New Roman" w:hAnsi="Times New Roman"/>
+          <w:color w:val="000000"/>
+          <w:sz w:val="24"/>
+        </w:rPr>
+        <w:t xml:space="preserve">4. </w:t>
+      </w:r>
+      <w:r>
+        <w:rPr>
+          <w:rFonts w:ascii="Times New Roman" w:hAnsi="Times New Roman"/>
+          <w:b/>
+          <w:color w:val="000000"/>
+          <w:sz w:val="24"/>
+        </w:rPr>
+        <w:t>Hybrid Multi-Tier Split Allocations</w:t>
+      </w:r>
+      <w:r>
+        <w:rPr>
+          <w:rFonts w:ascii="Times New Roman" w:hAnsi="Times New Roman"/>
+          <w:color w:val="000000"/>
+          <w:sz w:val="24"/>
+        </w:rPr>
+        <w:t>: Enhance the heuristic to support split allocations across multiple tiers (e.g., allocating 80% of archival log data to Object Storage and 20% of active index data to Block Storage).</w:t>
       </w:r>
     </w:p>
     <w:p>
@@ -2159,38 +2249,38 @@
         <w:rPr>
           <w:rFonts w:ascii="Times New Roman" w:hAnsi="Times New Roman"/>
           <w:b/>
-          <w:color w:val="1E293B"/>
+          <w:color w:val="000000"/>
           <w:sz w:val="28"/>
         </w:rPr>
-        <w:t>5.8 Chapter Summary and Conclusion</w:t>
+        <w:t>5.10 Chapter Summary and Conclusion</w:t>
       </w:r>
     </w:p>
     <w:p>
       <w:pPr>
-        <w:spacing w:before="0" w:after="120" w:line="276" w:lineRule="auto"/>
+        <w:spacing w:before="0" w:after="120" w:line="360" w:lineRule="auto"/>
       </w:pPr>
       <w:r>
         <w:rPr>
           <w:rFonts w:ascii="Times New Roman" w:hAnsi="Times New Roman"/>
-          <w:color w:val="0F172A"/>
-          <w:sz w:val="23"/>
+          <w:color w:val="000000"/>
+          <w:sz w:val="24"/>
         </w:rPr>
-        <w:t xml:space="preserve">This study successfully designed, implemented, and evaluated a heuristic approach to cloud storage resource allocation. By combining automated workload storage size estimation with a dual-objective Min-Max normalized scoring model, the system addresses the dual challenges of cloud cost optimization and SLA compliance. The empirical evaluation verified a </w:t>
+        <w:t xml:space="preserve">This study successfully designed, implemented, and evaluated a heuristic approach to cloud storage resource allocation. By combining automated workload storage size estimation with a dual-objective Min-Max normalized scoring model, the system addresses the dual challenges of cloud cost optimization and SLA availability compliance. Empirical evaluation verified a </w:t>
       </w:r>
       <w:r>
         <w:rPr>
           <w:rFonts w:ascii="Times New Roman" w:hAnsi="Times New Roman"/>
           <w:b/>
-          <w:color w:val="0F172A"/>
-          <w:sz w:val="23"/>
+          <w:color w:val="000000"/>
+          <w:sz w:val="24"/>
         </w:rPr>
         <w:t>17.81% reduction in storage expenditure</w:t>
       </w:r>
       <w:r>
         <w:rPr>
           <w:rFonts w:ascii="Times New Roman" w:hAnsi="Times New Roman"/>
-          <w:color w:val="0F172A"/>
-          <w:sz w:val="23"/>
+          <w:color w:val="000000"/>
+          <w:sz w:val="24"/>
         </w:rPr>
         <w:t xml:space="preserve"> alongside a </w:t>
       </w:r>
@@ -2198,18 +2288,18 @@
         <w:rPr>
           <w:rFonts w:ascii="Times New Roman" w:hAnsi="Times New Roman"/>
           <w:b/>
-          <w:color w:val="0F172A"/>
-          <w:sz w:val="23"/>
+          <w:color w:val="000000"/>
+          <w:sz w:val="24"/>
         </w:rPr>
-        <w:t>0% SLA violation rate</w:t>
+        <w:t>0% SLA breach rate</w:t>
       </w:r>
       <w:r>
         <w:rPr>
           <w:rFonts w:ascii="Times New Roman" w:hAnsi="Times New Roman"/>
-          <w:color w:val="0F172A"/>
-          <w:sz w:val="23"/>
+          <w:color w:val="000000"/>
+          <w:sz w:val="24"/>
         </w:rPr>
-        <w:t>. The resulting software prototype, detailed documentation, and benchmark datasets fulfill all initial research objectives and provide a scalable foundation for future intelligent cloud resource management platforms.</w:t>
+        <w:t xml:space="preserve"> across 500 benchmark allocation requests. The resulting software prototype, detailed documentation, and empirical datasets fulfill all initial research objectives and provide a scalable foundation for intelligent cloud resource management platforms.</w:t>
       </w:r>
     </w:p>
     <w:sectPr>

</xml_diff>